<commit_message>
modif Rapport fin de projet
</commit_message>
<xml_diff>
--- a/Rapport/0.Groupe/Rapport_Toit_Chauffant_Anti_Varroas.docx
+++ b/Rapport/0.Groupe/Rapport_Toit_Chauffant_Anti_Varroas.docx
@@ -11,22 +11,6 @@
       <w:pPr>
         <w:spacing w:before="80" w:after="80"/>
       </w:pPr>
-    </w:p>
-    <w:p>
-      <w:pPr>
-        <w:spacing w:after="120"/>
-        <w:jc w:val="center"/>
-      </w:pPr>
-      <w:r>
-        <w:rPr>
-          <w:b/>
-          <w:bCs/>
-          <w:color w:val="2E75B6"/>
-          <w:sz w:val="24"/>
-          <w:szCs w:val="24"/>
-        </w:rPr>
-        <w:t>PROJET UNIVERSITAIRE</w:t>
-      </w:r>
     </w:p>
     <w:p>
       <w:pPr>
@@ -108,6 +92,9 @@
         <w:jc w:val="center"/>
       </w:pPr>
       <w:r>
+        <w:rPr>
+          <w:noProof/>
+        </w:rPr>
         <w:drawing>
           <wp:inline distT="0" distB="0" distL="0" distR="0" wp14:anchorId="4F33AACA" wp14:editId="0B7FB5F7">
             <wp:extent cx="3434911" cy="3482732"/>
@@ -177,6 +164,7 @@
     <w:tbl>
       <w:tblPr>
         <w:tblW w:w="9026" w:type="dxa"/>
+        <w:jc w:val="center"/>
         <w:tblBorders>
           <w:top w:val="single" w:sz="4" w:space="0" w:color="auto"/>
           <w:left w:val="single" w:sz="4" w:space="0" w:color="auto"/>
@@ -196,12 +184,9 @@
         <w:gridCol w:w="4513"/>
       </w:tblGrid>
       <w:tr>
-        <w:tblPrEx>
-          <w:tblCellMar>
-            <w:top w:w="0" w:type="dxa"/>
-            <w:bottom w:w="0" w:type="dxa"/>
-          </w:tblCellMar>
-        </w:tblPrEx>
+        <w:trPr>
+          <w:jc w:val="center"/>
+        </w:trPr>
         <w:tc>
           <w:tcPr>
             <w:tcW w:w="4513" w:type="dxa"/>
@@ -220,6 +205,9 @@
             </w:tcMar>
           </w:tcPr>
           <w:p>
+            <w:pPr>
+              <w:jc w:val="center"/>
+            </w:pPr>
             <w:r>
               <w:rPr>
                 <w:b/>
@@ -247,22 +235,34 @@
             </w:tcMar>
           </w:tcPr>
           <w:p>
-            <w:r>
-              <w:rPr>
-                <w:color w:val="404040"/>
-              </w:rPr>
-              <w:t>ROTH – EUPHRASIE – BALD – BONDON</w:t>
+            <w:pPr>
+              <w:jc w:val="center"/>
+            </w:pPr>
+            <w:r>
+              <w:rPr>
+                <w:color w:val="404040"/>
+              </w:rPr>
+              <w:t>ROTH – EUPHRASIE – BALD</w:t>
+            </w:r>
+            <w:r>
+              <w:rPr>
+                <w:color w:val="404040"/>
+              </w:rPr>
+              <w:t>E</w:t>
+            </w:r>
+            <w:r>
+              <w:rPr>
+                <w:color w:val="404040"/>
+              </w:rPr>
+              <w:t xml:space="preserve"> – BONDON</w:t>
             </w:r>
           </w:p>
         </w:tc>
       </w:tr>
       <w:tr>
-        <w:tblPrEx>
-          <w:tblCellMar>
-            <w:top w:w="0" w:type="dxa"/>
-            <w:bottom w:w="0" w:type="dxa"/>
-          </w:tblCellMar>
-        </w:tblPrEx>
+        <w:trPr>
+          <w:jc w:val="center"/>
+        </w:trPr>
         <w:tc>
           <w:tcPr>
             <w:tcW w:w="4513" w:type="dxa"/>
@@ -281,6 +281,9 @@
             </w:tcMar>
           </w:tcPr>
           <w:p>
+            <w:pPr>
+              <w:jc w:val="center"/>
+            </w:pPr>
             <w:r>
               <w:rPr>
                 <w:b/>
@@ -308,6 +311,9 @@
             </w:tcMar>
           </w:tcPr>
           <w:p>
+            <w:pPr>
+              <w:jc w:val="center"/>
+            </w:pPr>
             <w:r>
               <w:rPr>
                 <w:color w:val="404040"/>
@@ -318,12 +324,9 @@
         </w:tc>
       </w:tr>
       <w:tr>
-        <w:tblPrEx>
-          <w:tblCellMar>
-            <w:top w:w="0" w:type="dxa"/>
-            <w:bottom w:w="0" w:type="dxa"/>
-          </w:tblCellMar>
-        </w:tblPrEx>
+        <w:trPr>
+          <w:jc w:val="center"/>
+        </w:trPr>
         <w:tc>
           <w:tcPr>
             <w:tcW w:w="4513" w:type="dxa"/>
@@ -342,6 +345,9 @@
             </w:tcMar>
           </w:tcPr>
           <w:p>
+            <w:pPr>
+              <w:jc w:val="center"/>
+            </w:pPr>
             <w:r>
               <w:rPr>
                 <w:b/>
@@ -369,6 +375,9 @@
             </w:tcMar>
           </w:tcPr>
           <w:p>
+            <w:pPr>
+              <w:jc w:val="center"/>
+            </w:pPr>
             <w:r>
               <w:rPr>
                 <w:color w:val="404040"/>
@@ -379,12 +388,9 @@
         </w:tc>
       </w:tr>
       <w:tr>
-        <w:tblPrEx>
-          <w:tblCellMar>
-            <w:top w:w="0" w:type="dxa"/>
-            <w:bottom w:w="0" w:type="dxa"/>
-          </w:tblCellMar>
-        </w:tblPrEx>
+        <w:trPr>
+          <w:jc w:val="center"/>
+        </w:trPr>
         <w:tc>
           <w:tcPr>
             <w:tcW w:w="4513" w:type="dxa"/>
@@ -403,6 +409,9 @@
             </w:tcMar>
           </w:tcPr>
           <w:p>
+            <w:pPr>
+              <w:jc w:val="center"/>
+            </w:pPr>
             <w:r>
               <w:rPr>
                 <w:b/>
@@ -430,6 +439,9 @@
             </w:tcMar>
           </w:tcPr>
           <w:p>
+            <w:pPr>
+              <w:jc w:val="center"/>
+            </w:pPr>
             <w:r>
               <w:rPr>
                 <w:color w:val="404040"/>
@@ -441,12 +453,21 @@
       </w:tr>
     </w:tbl>
     <w:p>
+      <w:pPr>
+        <w:jc w:val="center"/>
+      </w:pPr>
       <w:r>
         <w:br w:type="page"/>
       </w:r>
     </w:p>
     <w:sdt>
       <w:sdtPr>
+        <w:rPr>
+          <w:rFonts w:ascii="Arial" w:eastAsia="Arial" w:hAnsi="Arial" w:cs="Arial"/>
+          <w:color w:val="auto"/>
+          <w:sz w:val="22"/>
+          <w:szCs w:val="22"/>
+        </w:rPr>
         <w:id w:val="-1491784940"/>
         <w:docPartObj>
           <w:docPartGallery w:val="Table of Contents"/>
@@ -455,12 +476,8 @@
       </w:sdtPr>
       <w:sdtEndPr>
         <w:rPr>
-          <w:rFonts w:ascii="Arial" w:eastAsia="Arial" w:hAnsi="Arial" w:cs="Arial"/>
           <w:b/>
           <w:bCs/>
-          <w:color w:val="auto"/>
-          <w:sz w:val="22"/>
-          <w:szCs w:val="22"/>
         </w:rPr>
       </w:sdtEndPr>
       <w:sdtContent>
@@ -496,7 +513,7 @@
           <w:r>
             <w:fldChar w:fldCharType="separate"/>
           </w:r>
-          <w:hyperlink w:anchor="_Toc227918514" w:history="1">
+          <w:hyperlink w:anchor="_Toc227923006" w:history="1">
             <w:r>
               <w:rPr>
                 <w:rStyle w:val="Lienhypertexte"/>
@@ -523,7 +540,7 @@
                 <w:noProof/>
                 <w:webHidden/>
               </w:rPr>
-              <w:instrText xml:space="preserve"> PAGEREF _Toc227918514 \h </w:instrText>
+              <w:instrText xml:space="preserve"> PAGEREF _Toc227923006 \h </w:instrText>
             </w:r>
             <w:r>
               <w:rPr>
@@ -543,7 +560,7 @@
                 <w:noProof/>
                 <w:webHidden/>
               </w:rPr>
-              <w:t>3</w:t>
+              <w:t>4</w:t>
             </w:r>
             <w:r>
               <w:rPr>
@@ -569,7 +586,7 @@
               <w14:ligatures w14:val="standardContextual"/>
             </w:rPr>
           </w:pPr>
-          <w:hyperlink w:anchor="_Toc227918515" w:history="1">
+          <w:hyperlink w:anchor="_Toc227923007" w:history="1">
             <w:r>
               <w:rPr>
                 <w:rStyle w:val="Lienhypertexte"/>
@@ -596,7 +613,7 @@
                 <w:noProof/>
                 <w:webHidden/>
               </w:rPr>
-              <w:instrText xml:space="preserve"> PAGEREF _Toc227918515 \h </w:instrText>
+              <w:instrText xml:space="preserve"> PAGEREF _Toc227923007 \h </w:instrText>
             </w:r>
             <w:r>
               <w:rPr>
@@ -642,7 +659,7 @@
               <w14:ligatures w14:val="standardContextual"/>
             </w:rPr>
           </w:pPr>
-          <w:hyperlink w:anchor="_Toc227918516" w:history="1">
+          <w:hyperlink w:anchor="_Toc227923008" w:history="1">
             <w:r>
               <w:rPr>
                 <w:rStyle w:val="Lienhypertexte"/>
@@ -669,7 +686,7 @@
                 <w:noProof/>
                 <w:webHidden/>
               </w:rPr>
-              <w:instrText xml:space="preserve"> PAGEREF _Toc227918516 \h </w:instrText>
+              <w:instrText xml:space="preserve"> PAGEREF _Toc227923008 \h </w:instrText>
             </w:r>
             <w:r>
               <w:rPr>
@@ -715,7 +732,7 @@
               <w14:ligatures w14:val="standardContextual"/>
             </w:rPr>
           </w:pPr>
-          <w:hyperlink w:anchor="_Toc227918517" w:history="1">
+          <w:hyperlink w:anchor="_Toc227923009" w:history="1">
             <w:r>
               <w:rPr>
                 <w:rStyle w:val="Lienhypertexte"/>
@@ -742,7 +759,7 @@
                 <w:noProof/>
                 <w:webHidden/>
               </w:rPr>
-              <w:instrText xml:space="preserve"> PAGEREF _Toc227918517 \h </w:instrText>
+              <w:instrText xml:space="preserve"> PAGEREF _Toc227923009 \h </w:instrText>
             </w:r>
             <w:r>
               <w:rPr>
@@ -788,7 +805,7 @@
               <w14:ligatures w14:val="standardContextual"/>
             </w:rPr>
           </w:pPr>
-          <w:hyperlink w:anchor="_Toc227918518" w:history="1">
+          <w:hyperlink w:anchor="_Toc227923010" w:history="1">
             <w:r>
               <w:rPr>
                 <w:rStyle w:val="Lienhypertexte"/>
@@ -815,7 +832,7 @@
                 <w:noProof/>
                 <w:webHidden/>
               </w:rPr>
-              <w:instrText xml:space="preserve"> PAGEREF _Toc227918518 \h </w:instrText>
+              <w:instrText xml:space="preserve"> PAGEREF _Toc227923010 \h </w:instrText>
             </w:r>
             <w:r>
               <w:rPr>
@@ -861,7 +878,7 @@
               <w14:ligatures w14:val="standardContextual"/>
             </w:rPr>
           </w:pPr>
-          <w:hyperlink w:anchor="_Toc227918519" w:history="1">
+          <w:hyperlink w:anchor="_Toc227923011" w:history="1">
             <w:r>
               <w:rPr>
                 <w:rStyle w:val="Lienhypertexte"/>
@@ -888,7 +905,7 @@
                 <w:noProof/>
                 <w:webHidden/>
               </w:rPr>
-              <w:instrText xml:space="preserve"> PAGEREF _Toc227918519 \h </w:instrText>
+              <w:instrText xml:space="preserve"> PAGEREF _Toc227923011 \h </w:instrText>
             </w:r>
             <w:r>
               <w:rPr>
@@ -934,7 +951,7 @@
               <w14:ligatures w14:val="standardContextual"/>
             </w:rPr>
           </w:pPr>
-          <w:hyperlink w:anchor="_Toc227918520" w:history="1">
+          <w:hyperlink w:anchor="_Toc227923012" w:history="1">
             <w:r>
               <w:rPr>
                 <w:rStyle w:val="Lienhypertexte"/>
@@ -961,7 +978,7 @@
                 <w:noProof/>
                 <w:webHidden/>
               </w:rPr>
-              <w:instrText xml:space="preserve"> PAGEREF _Toc227918520 \h </w:instrText>
+              <w:instrText xml:space="preserve"> PAGEREF _Toc227923012 \h </w:instrText>
             </w:r>
             <w:r>
               <w:rPr>
@@ -1007,7 +1024,7 @@
               <w14:ligatures w14:val="standardContextual"/>
             </w:rPr>
           </w:pPr>
-          <w:hyperlink w:anchor="_Toc227918521" w:history="1">
+          <w:hyperlink w:anchor="_Toc227923013" w:history="1">
             <w:r>
               <w:rPr>
                 <w:rStyle w:val="Lienhypertexte"/>
@@ -1034,7 +1051,7 @@
                 <w:noProof/>
                 <w:webHidden/>
               </w:rPr>
-              <w:instrText xml:space="preserve"> PAGEREF _Toc227918521 \h </w:instrText>
+              <w:instrText xml:space="preserve"> PAGEREF _Toc227923013 \h </w:instrText>
             </w:r>
             <w:r>
               <w:rPr>
@@ -1080,7 +1097,7 @@
               <w14:ligatures w14:val="standardContextual"/>
             </w:rPr>
           </w:pPr>
-          <w:hyperlink w:anchor="_Toc227918522" w:history="1">
+          <w:hyperlink w:anchor="_Toc227923014" w:history="1">
             <w:r>
               <w:rPr>
                 <w:rStyle w:val="Lienhypertexte"/>
@@ -1107,7 +1124,7 @@
                 <w:noProof/>
                 <w:webHidden/>
               </w:rPr>
-              <w:instrText xml:space="preserve"> PAGEREF _Toc227918522 \h </w:instrText>
+              <w:instrText xml:space="preserve"> PAGEREF _Toc227923014 \h </w:instrText>
             </w:r>
             <w:r>
               <w:rPr>
@@ -1153,7 +1170,7 @@
               <w14:ligatures w14:val="standardContextual"/>
             </w:rPr>
           </w:pPr>
-          <w:hyperlink w:anchor="_Toc227918523" w:history="1">
+          <w:hyperlink w:anchor="_Toc227923015" w:history="1">
             <w:r>
               <w:rPr>
                 <w:rStyle w:val="Lienhypertexte"/>
@@ -1180,7 +1197,7 @@
                 <w:noProof/>
                 <w:webHidden/>
               </w:rPr>
-              <w:instrText xml:space="preserve"> PAGEREF _Toc227918523 \h </w:instrText>
+              <w:instrText xml:space="preserve"> PAGEREF _Toc227923015 \h </w:instrText>
             </w:r>
             <w:r>
               <w:rPr>
@@ -1226,7 +1243,7 @@
               <w14:ligatures w14:val="standardContextual"/>
             </w:rPr>
           </w:pPr>
-          <w:hyperlink w:anchor="_Toc227918524" w:history="1">
+          <w:hyperlink w:anchor="_Toc227923016" w:history="1">
             <w:r>
               <w:rPr>
                 <w:rStyle w:val="Lienhypertexte"/>
@@ -1253,7 +1270,7 @@
                 <w:noProof/>
                 <w:webHidden/>
               </w:rPr>
-              <w:instrText xml:space="preserve"> PAGEREF _Toc227918524 \h </w:instrText>
+              <w:instrText xml:space="preserve"> PAGEREF _Toc227923016 \h </w:instrText>
             </w:r>
             <w:r>
               <w:rPr>
@@ -1299,7 +1316,7 @@
               <w14:ligatures w14:val="standardContextual"/>
             </w:rPr>
           </w:pPr>
-          <w:hyperlink w:anchor="_Toc227918525" w:history="1">
+          <w:hyperlink w:anchor="_Toc227923017" w:history="1">
             <w:r>
               <w:rPr>
                 <w:rStyle w:val="Lienhypertexte"/>
@@ -1326,7 +1343,7 @@
                 <w:noProof/>
                 <w:webHidden/>
               </w:rPr>
-              <w:instrText xml:space="preserve"> PAGEREF _Toc227918525 \h </w:instrText>
+              <w:instrText xml:space="preserve"> PAGEREF _Toc227923017 \h </w:instrText>
             </w:r>
             <w:r>
               <w:rPr>
@@ -1372,7 +1389,7 @@
               <w14:ligatures w14:val="standardContextual"/>
             </w:rPr>
           </w:pPr>
-          <w:hyperlink w:anchor="_Toc227918526" w:history="1">
+          <w:hyperlink w:anchor="_Toc227923018" w:history="1">
             <w:r>
               <w:rPr>
                 <w:rStyle w:val="Lienhypertexte"/>
@@ -1399,7 +1416,7 @@
                 <w:noProof/>
                 <w:webHidden/>
               </w:rPr>
-              <w:instrText xml:space="preserve"> PAGEREF _Toc227918526 \h </w:instrText>
+              <w:instrText xml:space="preserve"> PAGEREF _Toc227923018 \h </w:instrText>
             </w:r>
             <w:r>
               <w:rPr>
@@ -1445,7 +1462,7 @@
               <w14:ligatures w14:val="standardContextual"/>
             </w:rPr>
           </w:pPr>
-          <w:hyperlink w:anchor="_Toc227918527" w:history="1">
+          <w:hyperlink w:anchor="_Toc227923019" w:history="1">
             <w:r>
               <w:rPr>
                 <w:rStyle w:val="Lienhypertexte"/>
@@ -1472,7 +1489,7 @@
                 <w:noProof/>
                 <w:webHidden/>
               </w:rPr>
-              <w:instrText xml:space="preserve"> PAGEREF _Toc227918527 \h </w:instrText>
+              <w:instrText xml:space="preserve"> PAGEREF _Toc227923019 \h </w:instrText>
             </w:r>
             <w:r>
               <w:rPr>
@@ -1492,7 +1509,7 @@
                 <w:noProof/>
                 <w:webHidden/>
               </w:rPr>
-              <w:t>8</w:t>
+              <w:t>9</w:t>
             </w:r>
             <w:r>
               <w:rPr>
@@ -1518,7 +1535,7 @@
               <w14:ligatures w14:val="standardContextual"/>
             </w:rPr>
           </w:pPr>
-          <w:hyperlink w:anchor="_Toc227918528" w:history="1">
+          <w:hyperlink w:anchor="_Toc227923020" w:history="1">
             <w:r>
               <w:rPr>
                 <w:rStyle w:val="Lienhypertexte"/>
@@ -1545,7 +1562,7 @@
                 <w:noProof/>
                 <w:webHidden/>
               </w:rPr>
-              <w:instrText xml:space="preserve"> PAGEREF _Toc227918528 \h </w:instrText>
+              <w:instrText xml:space="preserve"> PAGEREF _Toc227923020 \h </w:instrText>
             </w:r>
             <w:r>
               <w:rPr>
@@ -1565,7 +1582,7 @@
                 <w:noProof/>
                 <w:webHidden/>
               </w:rPr>
-              <w:t>9</w:t>
+              <w:t>10</w:t>
             </w:r>
             <w:r>
               <w:rPr>
@@ -1591,7 +1608,7 @@
               <w14:ligatures w14:val="standardContextual"/>
             </w:rPr>
           </w:pPr>
-          <w:hyperlink w:anchor="_Toc227918529" w:history="1">
+          <w:hyperlink w:anchor="_Toc227923021" w:history="1">
             <w:r>
               <w:rPr>
                 <w:rStyle w:val="Lienhypertexte"/>
@@ -1618,7 +1635,7 @@
                 <w:noProof/>
                 <w:webHidden/>
               </w:rPr>
-              <w:instrText xml:space="preserve"> PAGEREF _Toc227918529 \h </w:instrText>
+              <w:instrText xml:space="preserve"> PAGEREF _Toc227923021 \h </w:instrText>
             </w:r>
             <w:r>
               <w:rPr>
@@ -1638,7 +1655,7 @@
                 <w:noProof/>
                 <w:webHidden/>
               </w:rPr>
-              <w:t>9</w:t>
+              <w:t>10</w:t>
             </w:r>
             <w:r>
               <w:rPr>
@@ -1664,7 +1681,7 @@
               <w14:ligatures w14:val="standardContextual"/>
             </w:rPr>
           </w:pPr>
-          <w:hyperlink w:anchor="_Toc227918530" w:history="1">
+          <w:hyperlink w:anchor="_Toc227923022" w:history="1">
             <w:r>
               <w:rPr>
                 <w:rStyle w:val="Lienhypertexte"/>
@@ -1691,7 +1708,7 @@
                 <w:noProof/>
                 <w:webHidden/>
               </w:rPr>
-              <w:instrText xml:space="preserve"> PAGEREF _Toc227918530 \h </w:instrText>
+              <w:instrText xml:space="preserve"> PAGEREF _Toc227923022 \h </w:instrText>
             </w:r>
             <w:r>
               <w:rPr>
@@ -1711,7 +1728,7 @@
                 <w:noProof/>
                 <w:webHidden/>
               </w:rPr>
-              <w:t>9</w:t>
+              <w:t>10</w:t>
             </w:r>
             <w:r>
               <w:rPr>
@@ -1737,7 +1754,7 @@
               <w14:ligatures w14:val="standardContextual"/>
             </w:rPr>
           </w:pPr>
-          <w:hyperlink w:anchor="_Toc227918531" w:history="1">
+          <w:hyperlink w:anchor="_Toc227923023" w:history="1">
             <w:r>
               <w:rPr>
                 <w:rStyle w:val="Lienhypertexte"/>
@@ -1764,7 +1781,7 @@
                 <w:noProof/>
                 <w:webHidden/>
               </w:rPr>
-              <w:instrText xml:space="preserve"> PAGEREF _Toc227918531 \h </w:instrText>
+              <w:instrText xml:space="preserve"> PAGEREF _Toc227923023 \h </w:instrText>
             </w:r>
             <w:r>
               <w:rPr>
@@ -1784,7 +1801,7 @@
                 <w:noProof/>
                 <w:webHidden/>
               </w:rPr>
-              <w:t>10</w:t>
+              <w:t>11</w:t>
             </w:r>
             <w:r>
               <w:rPr>
@@ -1810,7 +1827,7 @@
               <w14:ligatures w14:val="standardContextual"/>
             </w:rPr>
           </w:pPr>
-          <w:hyperlink w:anchor="_Toc227918532" w:history="1">
+          <w:hyperlink w:anchor="_Toc227923024" w:history="1">
             <w:r>
               <w:rPr>
                 <w:rStyle w:val="Lienhypertexte"/>
@@ -1837,7 +1854,7 @@
                 <w:noProof/>
                 <w:webHidden/>
               </w:rPr>
-              <w:instrText xml:space="preserve"> PAGEREF _Toc227918532 \h </w:instrText>
+              <w:instrText xml:space="preserve"> PAGEREF _Toc227923024 \h </w:instrText>
             </w:r>
             <w:r>
               <w:rPr>
@@ -1857,7 +1874,7 @@
                 <w:noProof/>
                 <w:webHidden/>
               </w:rPr>
-              <w:t>10</w:t>
+              <w:t>11</w:t>
             </w:r>
             <w:r>
               <w:rPr>
@@ -1883,7 +1900,7 @@
               <w14:ligatures w14:val="standardContextual"/>
             </w:rPr>
           </w:pPr>
-          <w:hyperlink w:anchor="_Toc227918533" w:history="1">
+          <w:hyperlink w:anchor="_Toc227923025" w:history="1">
             <w:r>
               <w:rPr>
                 <w:rStyle w:val="Lienhypertexte"/>
@@ -1910,7 +1927,7 @@
                 <w:noProof/>
                 <w:webHidden/>
               </w:rPr>
-              <w:instrText xml:space="preserve"> PAGEREF _Toc227918533 \h </w:instrText>
+              <w:instrText xml:space="preserve"> PAGEREF _Toc227923025 \h </w:instrText>
             </w:r>
             <w:r>
               <w:rPr>
@@ -1930,7 +1947,7 @@
                 <w:noProof/>
                 <w:webHidden/>
               </w:rPr>
-              <w:t>10</w:t>
+              <w:t>11</w:t>
             </w:r>
             <w:r>
               <w:rPr>
@@ -1956,7 +1973,7 @@
               <w14:ligatures w14:val="standardContextual"/>
             </w:rPr>
           </w:pPr>
-          <w:hyperlink w:anchor="_Toc227918534" w:history="1">
+          <w:hyperlink w:anchor="_Toc227923026" w:history="1">
             <w:r>
               <w:rPr>
                 <w:rStyle w:val="Lienhypertexte"/>
@@ -1983,7 +2000,7 @@
                 <w:noProof/>
                 <w:webHidden/>
               </w:rPr>
-              <w:instrText xml:space="preserve"> PAGEREF _Toc227918534 \h </w:instrText>
+              <w:instrText xml:space="preserve"> PAGEREF _Toc227923026 \h </w:instrText>
             </w:r>
             <w:r>
               <w:rPr>
@@ -2003,7 +2020,7 @@
                 <w:noProof/>
                 <w:webHidden/>
               </w:rPr>
-              <w:t>10</w:t>
+              <w:t>11</w:t>
             </w:r>
             <w:r>
               <w:rPr>
@@ -2029,7 +2046,7 @@
               <w14:ligatures w14:val="standardContextual"/>
             </w:rPr>
           </w:pPr>
-          <w:hyperlink w:anchor="_Toc227918535" w:history="1">
+          <w:hyperlink w:anchor="_Toc227923027" w:history="1">
             <w:r>
               <w:rPr>
                 <w:rStyle w:val="Lienhypertexte"/>
@@ -2056,7 +2073,7 @@
                 <w:noProof/>
                 <w:webHidden/>
               </w:rPr>
-              <w:instrText xml:space="preserve"> PAGEREF _Toc227918535 \h </w:instrText>
+              <w:instrText xml:space="preserve"> PAGEREF _Toc227923027 \h </w:instrText>
             </w:r>
             <w:r>
               <w:rPr>
@@ -2076,7 +2093,7 @@
                 <w:noProof/>
                 <w:webHidden/>
               </w:rPr>
-              <w:t>11</w:t>
+              <w:t>12</w:t>
             </w:r>
             <w:r>
               <w:rPr>
@@ -2102,7 +2119,7 @@
               <w14:ligatures w14:val="standardContextual"/>
             </w:rPr>
           </w:pPr>
-          <w:hyperlink w:anchor="_Toc227918536" w:history="1">
+          <w:hyperlink w:anchor="_Toc227923028" w:history="1">
             <w:r>
               <w:rPr>
                 <w:rStyle w:val="Lienhypertexte"/>
@@ -2129,7 +2146,7 @@
                 <w:noProof/>
                 <w:webHidden/>
               </w:rPr>
-              <w:instrText xml:space="preserve"> PAGEREF _Toc227918536 \h </w:instrText>
+              <w:instrText xml:space="preserve"> PAGEREF _Toc227923028 \h </w:instrText>
             </w:r>
             <w:r>
               <w:rPr>
@@ -2149,7 +2166,7 @@
                 <w:noProof/>
                 <w:webHidden/>
               </w:rPr>
-              <w:t>12</w:t>
+              <w:t>13</w:t>
             </w:r>
             <w:r>
               <w:rPr>
@@ -2175,7 +2192,7 @@
               <w14:ligatures w14:val="standardContextual"/>
             </w:rPr>
           </w:pPr>
-          <w:hyperlink w:anchor="_Toc227918537" w:history="1">
+          <w:hyperlink w:anchor="_Toc227923029" w:history="1">
             <w:r>
               <w:rPr>
                 <w:rStyle w:val="Lienhypertexte"/>
@@ -2202,7 +2219,7 @@
                 <w:noProof/>
                 <w:webHidden/>
               </w:rPr>
-              <w:instrText xml:space="preserve"> PAGEREF _Toc227918537 \h </w:instrText>
+              <w:instrText xml:space="preserve"> PAGEREF _Toc227923029 \h </w:instrText>
             </w:r>
             <w:r>
               <w:rPr>
@@ -2222,7 +2239,7 @@
                 <w:noProof/>
                 <w:webHidden/>
               </w:rPr>
-              <w:t>12</w:t>
+              <w:t>13</w:t>
             </w:r>
             <w:r>
               <w:rPr>
@@ -2248,7 +2265,7 @@
               <w14:ligatures w14:val="standardContextual"/>
             </w:rPr>
           </w:pPr>
-          <w:hyperlink w:anchor="_Toc227918538" w:history="1">
+          <w:hyperlink w:anchor="_Toc227923030" w:history="1">
             <w:r>
               <w:rPr>
                 <w:rStyle w:val="Lienhypertexte"/>
@@ -2275,7 +2292,7 @@
                 <w:noProof/>
                 <w:webHidden/>
               </w:rPr>
-              <w:instrText xml:space="preserve"> PAGEREF _Toc227918538 \h </w:instrText>
+              <w:instrText xml:space="preserve"> PAGEREF _Toc227923030 \h </w:instrText>
             </w:r>
             <w:r>
               <w:rPr>
@@ -2295,7 +2312,7 @@
                 <w:noProof/>
                 <w:webHidden/>
               </w:rPr>
-              <w:t>12</w:t>
+              <w:t>13</w:t>
             </w:r>
             <w:r>
               <w:rPr>
@@ -2321,7 +2338,7 @@
               <w14:ligatures w14:val="standardContextual"/>
             </w:rPr>
           </w:pPr>
-          <w:hyperlink w:anchor="_Toc227918539" w:history="1">
+          <w:hyperlink w:anchor="_Toc227923031" w:history="1">
             <w:r>
               <w:rPr>
                 <w:rStyle w:val="Lienhypertexte"/>
@@ -2348,7 +2365,7 @@
                 <w:noProof/>
                 <w:webHidden/>
               </w:rPr>
-              <w:instrText xml:space="preserve"> PAGEREF _Toc227918539 \h </w:instrText>
+              <w:instrText xml:space="preserve"> PAGEREF _Toc227923031 \h </w:instrText>
             </w:r>
             <w:r>
               <w:rPr>
@@ -2368,7 +2385,7 @@
                 <w:noProof/>
                 <w:webHidden/>
               </w:rPr>
-              <w:t>12</w:t>
+              <w:t>13</w:t>
             </w:r>
             <w:r>
               <w:rPr>
@@ -2394,7 +2411,7 @@
               <w14:ligatures w14:val="standardContextual"/>
             </w:rPr>
           </w:pPr>
-          <w:hyperlink w:anchor="_Toc227918540" w:history="1">
+          <w:hyperlink w:anchor="_Toc227923032" w:history="1">
             <w:r>
               <w:rPr>
                 <w:rStyle w:val="Lienhypertexte"/>
@@ -2421,7 +2438,7 @@
                 <w:noProof/>
                 <w:webHidden/>
               </w:rPr>
-              <w:instrText xml:space="preserve"> PAGEREF _Toc227918540 \h </w:instrText>
+              <w:instrText xml:space="preserve"> PAGEREF _Toc227923032 \h </w:instrText>
             </w:r>
             <w:r>
               <w:rPr>
@@ -2441,7 +2458,7 @@
                 <w:noProof/>
                 <w:webHidden/>
               </w:rPr>
-              <w:t>12</w:t>
+              <w:t>13</w:t>
             </w:r>
             <w:r>
               <w:rPr>
@@ -2467,7 +2484,7 @@
               <w14:ligatures w14:val="standardContextual"/>
             </w:rPr>
           </w:pPr>
-          <w:hyperlink w:anchor="_Toc227918541" w:history="1">
+          <w:hyperlink w:anchor="_Toc227923033" w:history="1">
             <w:r>
               <w:rPr>
                 <w:rStyle w:val="Lienhypertexte"/>
@@ -2494,7 +2511,7 @@
                 <w:noProof/>
                 <w:webHidden/>
               </w:rPr>
-              <w:instrText xml:space="preserve"> PAGEREF _Toc227918541 \h </w:instrText>
+              <w:instrText xml:space="preserve"> PAGEREF _Toc227923033 \h </w:instrText>
             </w:r>
             <w:r>
               <w:rPr>
@@ -2514,7 +2531,7 @@
                 <w:noProof/>
                 <w:webHidden/>
               </w:rPr>
-              <w:t>13</w:t>
+              <w:t>14</w:t>
             </w:r>
             <w:r>
               <w:rPr>
@@ -2540,7 +2557,7 @@
               <w14:ligatures w14:val="standardContextual"/>
             </w:rPr>
           </w:pPr>
-          <w:hyperlink w:anchor="_Toc227918542" w:history="1">
+          <w:hyperlink w:anchor="_Toc227923034" w:history="1">
             <w:r>
               <w:rPr>
                 <w:rStyle w:val="Lienhypertexte"/>
@@ -2567,7 +2584,7 @@
                 <w:noProof/>
                 <w:webHidden/>
               </w:rPr>
-              <w:instrText xml:space="preserve"> PAGEREF _Toc227918542 \h </w:instrText>
+              <w:instrText xml:space="preserve"> PAGEREF _Toc227923034 \h </w:instrText>
             </w:r>
             <w:r>
               <w:rPr>
@@ -2587,7 +2604,7 @@
                 <w:noProof/>
                 <w:webHidden/>
               </w:rPr>
-              <w:t>13</w:t>
+              <w:t>14</w:t>
             </w:r>
             <w:r>
               <w:rPr>
@@ -2613,7 +2630,7 @@
               <w14:ligatures w14:val="standardContextual"/>
             </w:rPr>
           </w:pPr>
-          <w:hyperlink w:anchor="_Toc227918543" w:history="1">
+          <w:hyperlink w:anchor="_Toc227923035" w:history="1">
             <w:r>
               <w:rPr>
                 <w:rStyle w:val="Lienhypertexte"/>
@@ -2640,7 +2657,7 @@
                 <w:noProof/>
                 <w:webHidden/>
               </w:rPr>
-              <w:instrText xml:space="preserve"> PAGEREF _Toc227918543 \h </w:instrText>
+              <w:instrText xml:space="preserve"> PAGEREF _Toc227923035 \h </w:instrText>
             </w:r>
             <w:r>
               <w:rPr>
@@ -2660,7 +2677,7 @@
                 <w:noProof/>
                 <w:webHidden/>
               </w:rPr>
-              <w:t>13</w:t>
+              <w:t>14</w:t>
             </w:r>
             <w:r>
               <w:rPr>
@@ -2686,7 +2703,7 @@
               <w14:ligatures w14:val="standardContextual"/>
             </w:rPr>
           </w:pPr>
-          <w:hyperlink w:anchor="_Toc227918544" w:history="1">
+          <w:hyperlink w:anchor="_Toc227923036" w:history="1">
             <w:r>
               <w:rPr>
                 <w:rStyle w:val="Lienhypertexte"/>
@@ -2713,7 +2730,7 @@
                 <w:noProof/>
                 <w:webHidden/>
               </w:rPr>
-              <w:instrText xml:space="preserve"> PAGEREF _Toc227918544 \h </w:instrText>
+              <w:instrText xml:space="preserve"> PAGEREF _Toc227923036 \h </w:instrText>
             </w:r>
             <w:r>
               <w:rPr>
@@ -2733,7 +2750,7 @@
                 <w:noProof/>
                 <w:webHidden/>
               </w:rPr>
-              <w:t>13</w:t>
+              <w:t>14</w:t>
             </w:r>
             <w:r>
               <w:rPr>
@@ -2759,7 +2776,7 @@
               <w14:ligatures w14:val="standardContextual"/>
             </w:rPr>
           </w:pPr>
-          <w:hyperlink w:anchor="_Toc227918545" w:history="1">
+          <w:hyperlink w:anchor="_Toc227923037" w:history="1">
             <w:r>
               <w:rPr>
                 <w:rStyle w:val="Lienhypertexte"/>
@@ -2786,7 +2803,7 @@
                 <w:noProof/>
                 <w:webHidden/>
               </w:rPr>
-              <w:instrText xml:space="preserve"> PAGEREF _Toc227918545 \h </w:instrText>
+              <w:instrText xml:space="preserve"> PAGEREF _Toc227923037 \h </w:instrText>
             </w:r>
             <w:r>
               <w:rPr>
@@ -2832,7 +2849,7 @@
               <w14:ligatures w14:val="standardContextual"/>
             </w:rPr>
           </w:pPr>
-          <w:hyperlink w:anchor="_Toc227918546" w:history="1">
+          <w:hyperlink w:anchor="_Toc227923038" w:history="1">
             <w:r>
               <w:rPr>
                 <w:rStyle w:val="Lienhypertexte"/>
@@ -2859,7 +2876,7 @@
                 <w:noProof/>
                 <w:webHidden/>
               </w:rPr>
-              <w:instrText xml:space="preserve"> PAGEREF _Toc227918546 \h </w:instrText>
+              <w:instrText xml:space="preserve"> PAGEREF _Toc227923038 \h </w:instrText>
             </w:r>
             <w:r>
               <w:rPr>
@@ -2905,7 +2922,7 @@
               <w14:ligatures w14:val="standardContextual"/>
             </w:rPr>
           </w:pPr>
-          <w:hyperlink w:anchor="_Toc227918547" w:history="1">
+          <w:hyperlink w:anchor="_Toc227923039" w:history="1">
             <w:r>
               <w:rPr>
                 <w:rStyle w:val="Lienhypertexte"/>
@@ -2932,7 +2949,7 @@
                 <w:noProof/>
                 <w:webHidden/>
               </w:rPr>
-              <w:instrText xml:space="preserve"> PAGEREF _Toc227918547 \h </w:instrText>
+              <w:instrText xml:space="preserve"> PAGEREF _Toc227923039 \h </w:instrText>
             </w:r>
             <w:r>
               <w:rPr>
@@ -2978,7 +2995,7 @@
               <w14:ligatures w14:val="standardContextual"/>
             </w:rPr>
           </w:pPr>
-          <w:hyperlink w:anchor="_Toc227918548" w:history="1">
+          <w:hyperlink w:anchor="_Toc227923040" w:history="1">
             <w:r>
               <w:rPr>
                 <w:rStyle w:val="Lienhypertexte"/>
@@ -3005,7 +3022,7 @@
                 <w:noProof/>
                 <w:webHidden/>
               </w:rPr>
-              <w:instrText xml:space="preserve"> PAGEREF _Toc227918548 \h </w:instrText>
+              <w:instrText xml:space="preserve"> PAGEREF _Toc227923040 \h </w:instrText>
             </w:r>
             <w:r>
               <w:rPr>
@@ -3051,7 +3068,7 @@
               <w14:ligatures w14:val="standardContextual"/>
             </w:rPr>
           </w:pPr>
-          <w:hyperlink w:anchor="_Toc227918549" w:history="1">
+          <w:hyperlink w:anchor="_Toc227923041" w:history="1">
             <w:r>
               <w:rPr>
                 <w:rStyle w:val="Lienhypertexte"/>
@@ -3078,7 +3095,7 @@
                 <w:noProof/>
                 <w:webHidden/>
               </w:rPr>
-              <w:instrText xml:space="preserve"> PAGEREF _Toc227918549 \h </w:instrText>
+              <w:instrText xml:space="preserve"> PAGEREF _Toc227923041 \h </w:instrText>
             </w:r>
             <w:r>
               <w:rPr>
@@ -3124,7 +3141,7 @@
               <w14:ligatures w14:val="standardContextual"/>
             </w:rPr>
           </w:pPr>
-          <w:hyperlink w:anchor="_Toc227918550" w:history="1">
+          <w:hyperlink w:anchor="_Toc227923042" w:history="1">
             <w:r>
               <w:rPr>
                 <w:rStyle w:val="Lienhypertexte"/>
@@ -3151,7 +3168,7 @@
                 <w:noProof/>
                 <w:webHidden/>
               </w:rPr>
-              <w:instrText xml:space="preserve"> PAGEREF _Toc227918550 \h </w:instrText>
+              <w:instrText xml:space="preserve"> PAGEREF _Toc227923042 \h </w:instrText>
             </w:r>
             <w:r>
               <w:rPr>
@@ -3171,7 +3188,7 @@
                 <w:noProof/>
                 <w:webHidden/>
               </w:rPr>
-              <w:t>15</w:t>
+              <w:t>16</w:t>
             </w:r>
             <w:r>
               <w:rPr>
@@ -3197,7 +3214,7 @@
               <w14:ligatures w14:val="standardContextual"/>
             </w:rPr>
           </w:pPr>
-          <w:hyperlink w:anchor="_Toc227918551" w:history="1">
+          <w:hyperlink w:anchor="_Toc227923043" w:history="1">
             <w:r>
               <w:rPr>
                 <w:rStyle w:val="Lienhypertexte"/>
@@ -3224,7 +3241,7 @@
                 <w:noProof/>
                 <w:webHidden/>
               </w:rPr>
-              <w:instrText xml:space="preserve"> PAGEREF _Toc227918551 \h </w:instrText>
+              <w:instrText xml:space="preserve"> PAGEREF _Toc227923043 \h </w:instrText>
             </w:r>
             <w:r>
               <w:rPr>
@@ -3244,7 +3261,7 @@
                 <w:noProof/>
                 <w:webHidden/>
               </w:rPr>
-              <w:t>15</w:t>
+              <w:t>16</w:t>
             </w:r>
             <w:r>
               <w:rPr>
@@ -3270,7 +3287,7 @@
               <w14:ligatures w14:val="standardContextual"/>
             </w:rPr>
           </w:pPr>
-          <w:hyperlink w:anchor="_Toc227918552" w:history="1">
+          <w:hyperlink w:anchor="_Toc227923044" w:history="1">
             <w:r>
               <w:rPr>
                 <w:rStyle w:val="Lienhypertexte"/>
@@ -3297,7 +3314,7 @@
                 <w:noProof/>
                 <w:webHidden/>
               </w:rPr>
-              <w:instrText xml:space="preserve"> PAGEREF _Toc227918552 \h </w:instrText>
+              <w:instrText xml:space="preserve"> PAGEREF _Toc227923044 \h </w:instrText>
             </w:r>
             <w:r>
               <w:rPr>
@@ -3343,7 +3360,7 @@
               <w14:ligatures w14:val="standardContextual"/>
             </w:rPr>
           </w:pPr>
-          <w:hyperlink w:anchor="_Toc227918553" w:history="1">
+          <w:hyperlink w:anchor="_Toc227923045" w:history="1">
             <w:r>
               <w:rPr>
                 <w:rStyle w:val="Lienhypertexte"/>
@@ -3370,7 +3387,7 @@
                 <w:noProof/>
                 <w:webHidden/>
               </w:rPr>
-              <w:instrText xml:space="preserve"> PAGEREF _Toc227918553 \h </w:instrText>
+              <w:instrText xml:space="preserve"> PAGEREF _Toc227923045 \h </w:instrText>
             </w:r>
             <w:r>
               <w:rPr>
@@ -3416,7 +3433,7 @@
               <w14:ligatures w14:val="standardContextual"/>
             </w:rPr>
           </w:pPr>
-          <w:hyperlink w:anchor="_Toc227918554" w:history="1">
+          <w:hyperlink w:anchor="_Toc227923046" w:history="1">
             <w:r>
               <w:rPr>
                 <w:rStyle w:val="Lienhypertexte"/>
@@ -3443,7 +3460,7 @@
                 <w:noProof/>
                 <w:webHidden/>
               </w:rPr>
-              <w:instrText xml:space="preserve"> PAGEREF _Toc227918554 \h </w:instrText>
+              <w:instrText xml:space="preserve"> PAGEREF _Toc227923046 \h </w:instrText>
             </w:r>
             <w:r>
               <w:rPr>
@@ -3489,7 +3506,7 @@
               <w14:ligatures w14:val="standardContextual"/>
             </w:rPr>
           </w:pPr>
-          <w:hyperlink w:anchor="_Toc227918555" w:history="1">
+          <w:hyperlink w:anchor="_Toc227923047" w:history="1">
             <w:r>
               <w:rPr>
                 <w:rStyle w:val="Lienhypertexte"/>
@@ -3516,7 +3533,7 @@
                 <w:noProof/>
                 <w:webHidden/>
               </w:rPr>
-              <w:instrText xml:space="preserve"> PAGEREF _Toc227918555 \h </w:instrText>
+              <w:instrText xml:space="preserve"> PAGEREF _Toc227923047 \h </w:instrText>
             </w:r>
             <w:r>
               <w:rPr>
@@ -3562,7 +3579,7 @@
               <w14:ligatures w14:val="standardContextual"/>
             </w:rPr>
           </w:pPr>
-          <w:hyperlink w:anchor="_Toc227918556" w:history="1">
+          <w:hyperlink w:anchor="_Toc227923048" w:history="1">
             <w:r>
               <w:rPr>
                 <w:rStyle w:val="Lienhypertexte"/>
@@ -3589,7 +3606,7 @@
                 <w:noProof/>
                 <w:webHidden/>
               </w:rPr>
-              <w:instrText xml:space="preserve"> PAGEREF _Toc227918556 \h </w:instrText>
+              <w:instrText xml:space="preserve"> PAGEREF _Toc227923048 \h </w:instrText>
             </w:r>
             <w:r>
               <w:rPr>
@@ -3635,7 +3652,7 @@
               <w14:ligatures w14:val="standardContextual"/>
             </w:rPr>
           </w:pPr>
-          <w:hyperlink w:anchor="_Toc227918557" w:history="1">
+          <w:hyperlink w:anchor="_Toc227923049" w:history="1">
             <w:r>
               <w:rPr>
                 <w:rStyle w:val="Lienhypertexte"/>
@@ -3662,7 +3679,7 @@
                 <w:noProof/>
                 <w:webHidden/>
               </w:rPr>
-              <w:instrText xml:space="preserve"> PAGEREF _Toc227918557 \h </w:instrText>
+              <w:instrText xml:space="preserve"> PAGEREF _Toc227923049 \h </w:instrText>
             </w:r>
             <w:r>
               <w:rPr>
@@ -3708,7 +3725,7 @@
               <w14:ligatures w14:val="standardContextual"/>
             </w:rPr>
           </w:pPr>
-          <w:hyperlink w:anchor="_Toc227918558" w:history="1">
+          <w:hyperlink w:anchor="_Toc227923050" w:history="1">
             <w:r>
               <w:rPr>
                 <w:rStyle w:val="Lienhypertexte"/>
@@ -3735,7 +3752,7 @@
                 <w:noProof/>
                 <w:webHidden/>
               </w:rPr>
-              <w:instrText xml:space="preserve"> PAGEREF _Toc227918558 \h </w:instrText>
+              <w:instrText xml:space="preserve"> PAGEREF _Toc227923050 \h </w:instrText>
             </w:r>
             <w:r>
               <w:rPr>
@@ -3781,7 +3798,7 @@
               <w14:ligatures w14:val="standardContextual"/>
             </w:rPr>
           </w:pPr>
-          <w:hyperlink w:anchor="_Toc227918559" w:history="1">
+          <w:hyperlink w:anchor="_Toc227923051" w:history="1">
             <w:r>
               <w:rPr>
                 <w:rStyle w:val="Lienhypertexte"/>
@@ -3808,7 +3825,7 @@
                 <w:noProof/>
                 <w:webHidden/>
               </w:rPr>
-              <w:instrText xml:space="preserve"> PAGEREF _Toc227918559 \h </w:instrText>
+              <w:instrText xml:space="preserve"> PAGEREF _Toc227923051 \h </w:instrText>
             </w:r>
             <w:r>
               <w:rPr>
@@ -3854,7 +3871,7 @@
               <w14:ligatures w14:val="standardContextual"/>
             </w:rPr>
           </w:pPr>
-          <w:hyperlink w:anchor="_Toc227918560" w:history="1">
+          <w:hyperlink w:anchor="_Toc227923052" w:history="1">
             <w:r>
               <w:rPr>
                 <w:rStyle w:val="Lienhypertexte"/>
@@ -3881,7 +3898,7 @@
                 <w:noProof/>
                 <w:webHidden/>
               </w:rPr>
-              <w:instrText xml:space="preserve"> PAGEREF _Toc227918560 \h </w:instrText>
+              <w:instrText xml:space="preserve"> PAGEREF _Toc227923052 \h </w:instrText>
             </w:r>
             <w:r>
               <w:rPr>
@@ -3927,7 +3944,7 @@
               <w14:ligatures w14:val="standardContextual"/>
             </w:rPr>
           </w:pPr>
-          <w:hyperlink w:anchor="_Toc227918561" w:history="1">
+          <w:hyperlink w:anchor="_Toc227923053" w:history="1">
             <w:r>
               <w:rPr>
                 <w:rStyle w:val="Lienhypertexte"/>
@@ -3954,7 +3971,7 @@
                 <w:noProof/>
                 <w:webHidden/>
               </w:rPr>
-              <w:instrText xml:space="preserve"> PAGEREF _Toc227918561 \h </w:instrText>
+              <w:instrText xml:space="preserve"> PAGEREF _Toc227923053 \h </w:instrText>
             </w:r>
             <w:r>
               <w:rPr>
@@ -4000,7 +4017,7 @@
               <w14:ligatures w14:val="standardContextual"/>
             </w:rPr>
           </w:pPr>
-          <w:hyperlink w:anchor="_Toc227918562" w:history="1">
+          <w:hyperlink w:anchor="_Toc227923054" w:history="1">
             <w:r>
               <w:rPr>
                 <w:rStyle w:val="Lienhypertexte"/>
@@ -4027,7 +4044,7 @@
                 <w:noProof/>
                 <w:webHidden/>
               </w:rPr>
-              <w:instrText xml:space="preserve"> PAGEREF _Toc227918562 \h </w:instrText>
+              <w:instrText xml:space="preserve"> PAGEREF _Toc227923054 \h </w:instrText>
             </w:r>
             <w:r>
               <w:rPr>
@@ -4073,7 +4090,7 @@
               <w14:ligatures w14:val="standardContextual"/>
             </w:rPr>
           </w:pPr>
-          <w:hyperlink w:anchor="_Toc227918563" w:history="1">
+          <w:hyperlink w:anchor="_Toc227923055" w:history="1">
             <w:r>
               <w:rPr>
                 <w:rStyle w:val="Lienhypertexte"/>
@@ -4100,7 +4117,7 @@
                 <w:noProof/>
                 <w:webHidden/>
               </w:rPr>
-              <w:instrText xml:space="preserve"> PAGEREF _Toc227918563 \h </w:instrText>
+              <w:instrText xml:space="preserve"> PAGEREF _Toc227923055 \h </w:instrText>
             </w:r>
             <w:r>
               <w:rPr>
@@ -4146,7 +4163,7 @@
               <w14:ligatures w14:val="standardContextual"/>
             </w:rPr>
           </w:pPr>
-          <w:hyperlink w:anchor="_Toc227918564" w:history="1">
+          <w:hyperlink w:anchor="_Toc227923056" w:history="1">
             <w:r>
               <w:rPr>
                 <w:rStyle w:val="Lienhypertexte"/>
@@ -4173,7 +4190,7 @@
                 <w:noProof/>
                 <w:webHidden/>
               </w:rPr>
-              <w:instrText xml:space="preserve"> PAGEREF _Toc227918564 \h </w:instrText>
+              <w:instrText xml:space="preserve"> PAGEREF _Toc227923056 \h </w:instrText>
             </w:r>
             <w:r>
               <w:rPr>
@@ -4219,7 +4236,7 @@
               <w14:ligatures w14:val="standardContextual"/>
             </w:rPr>
           </w:pPr>
-          <w:hyperlink w:anchor="_Toc227918565" w:history="1">
+          <w:hyperlink w:anchor="_Toc227923057" w:history="1">
             <w:r>
               <w:rPr>
                 <w:rStyle w:val="Lienhypertexte"/>
@@ -4246,7 +4263,7 @@
                 <w:noProof/>
                 <w:webHidden/>
               </w:rPr>
-              <w:instrText xml:space="preserve"> PAGEREF _Toc227918565 \h </w:instrText>
+              <w:instrText xml:space="preserve"> PAGEREF _Toc227923057 \h </w:instrText>
             </w:r>
             <w:r>
               <w:rPr>
@@ -4292,7 +4309,7 @@
               <w14:ligatures w14:val="standardContextual"/>
             </w:rPr>
           </w:pPr>
-          <w:hyperlink w:anchor="_Toc227918566" w:history="1">
+          <w:hyperlink w:anchor="_Toc227923058" w:history="1">
             <w:r>
               <w:rPr>
                 <w:rStyle w:val="Lienhypertexte"/>
@@ -4319,7 +4336,7 @@
                 <w:noProof/>
                 <w:webHidden/>
               </w:rPr>
-              <w:instrText xml:space="preserve"> PAGEREF _Toc227918566 \h </w:instrText>
+              <w:instrText xml:space="preserve"> PAGEREF _Toc227923058 \h </w:instrText>
             </w:r>
             <w:r>
               <w:rPr>
@@ -4365,7 +4382,7 @@
               <w14:ligatures w14:val="standardContextual"/>
             </w:rPr>
           </w:pPr>
-          <w:hyperlink w:anchor="_Toc227918567" w:history="1">
+          <w:hyperlink w:anchor="_Toc227923059" w:history="1">
             <w:r>
               <w:rPr>
                 <w:rStyle w:val="Lienhypertexte"/>
@@ -4392,7 +4409,7 @@
                 <w:noProof/>
                 <w:webHidden/>
               </w:rPr>
-              <w:instrText xml:space="preserve"> PAGEREF _Toc227918567 \h </w:instrText>
+              <w:instrText xml:space="preserve"> PAGEREF _Toc227923059 \h </w:instrText>
             </w:r>
             <w:r>
               <w:rPr>
@@ -4438,7 +4455,7 @@
               <w14:ligatures w14:val="standardContextual"/>
             </w:rPr>
           </w:pPr>
-          <w:hyperlink w:anchor="_Toc227918568" w:history="1">
+          <w:hyperlink w:anchor="_Toc227923060" w:history="1">
             <w:r>
               <w:rPr>
                 <w:rStyle w:val="Lienhypertexte"/>
@@ -4465,7 +4482,7 @@
                 <w:noProof/>
                 <w:webHidden/>
               </w:rPr>
-              <w:instrText xml:space="preserve"> PAGEREF _Toc227918568 \h </w:instrText>
+              <w:instrText xml:space="preserve"> PAGEREF _Toc227923060 \h </w:instrText>
             </w:r>
             <w:r>
               <w:rPr>
@@ -4511,7 +4528,7 @@
               <w14:ligatures w14:val="standardContextual"/>
             </w:rPr>
           </w:pPr>
-          <w:hyperlink w:anchor="_Toc227918569" w:history="1">
+          <w:hyperlink w:anchor="_Toc227923061" w:history="1">
             <w:r>
               <w:rPr>
                 <w:rStyle w:val="Lienhypertexte"/>
@@ -4538,7 +4555,7 @@
                 <w:noProof/>
                 <w:webHidden/>
               </w:rPr>
-              <w:instrText xml:space="preserve"> PAGEREF _Toc227918569 \h </w:instrText>
+              <w:instrText xml:space="preserve"> PAGEREF _Toc227923061 \h </w:instrText>
             </w:r>
             <w:r>
               <w:rPr>
@@ -4558,7 +4575,7 @@
                 <w:noProof/>
                 <w:webHidden/>
               </w:rPr>
-              <w:t>20</w:t>
+              <w:t>21</w:t>
             </w:r>
             <w:r>
               <w:rPr>
@@ -4584,7 +4601,7 @@
               <w14:ligatures w14:val="standardContextual"/>
             </w:rPr>
           </w:pPr>
-          <w:hyperlink w:anchor="_Toc227918570" w:history="1">
+          <w:hyperlink w:anchor="_Toc227923062" w:history="1">
             <w:r>
               <w:rPr>
                 <w:rStyle w:val="Lienhypertexte"/>
@@ -4611,7 +4628,7 @@
                 <w:noProof/>
                 <w:webHidden/>
               </w:rPr>
-              <w:instrText xml:space="preserve"> PAGEREF _Toc227918570 \h </w:instrText>
+              <w:instrText xml:space="preserve"> PAGEREF _Toc227923062 \h </w:instrText>
             </w:r>
             <w:r>
               <w:rPr>
@@ -4657,7 +4674,7 @@
               <w14:ligatures w14:val="standardContextual"/>
             </w:rPr>
           </w:pPr>
-          <w:hyperlink w:anchor="_Toc227918571" w:history="1">
+          <w:hyperlink w:anchor="_Toc227923063" w:history="1">
             <w:r>
               <w:rPr>
                 <w:rStyle w:val="Lienhypertexte"/>
@@ -4684,7 +4701,7 @@
                 <w:noProof/>
                 <w:webHidden/>
               </w:rPr>
-              <w:instrText xml:space="preserve"> PAGEREF _Toc227918571 \h </w:instrText>
+              <w:instrText xml:space="preserve"> PAGEREF _Toc227923063 \h </w:instrText>
             </w:r>
             <w:r>
               <w:rPr>
@@ -4730,7 +4747,7 @@
               <w14:ligatures w14:val="standardContextual"/>
             </w:rPr>
           </w:pPr>
-          <w:hyperlink w:anchor="_Toc227918572" w:history="1">
+          <w:hyperlink w:anchor="_Toc227923064" w:history="1">
             <w:r>
               <w:rPr>
                 <w:rStyle w:val="Lienhypertexte"/>
@@ -4757,7 +4774,7 @@
                 <w:noProof/>
                 <w:webHidden/>
               </w:rPr>
-              <w:instrText xml:space="preserve"> PAGEREF _Toc227918572 \h </w:instrText>
+              <w:instrText xml:space="preserve"> PAGEREF _Toc227923064 \h </w:instrText>
             </w:r>
             <w:r>
               <w:rPr>
@@ -4803,7 +4820,7 @@
               <w14:ligatures w14:val="standardContextual"/>
             </w:rPr>
           </w:pPr>
-          <w:hyperlink w:anchor="_Toc227918573" w:history="1">
+          <w:hyperlink w:anchor="_Toc227923065" w:history="1">
             <w:r>
               <w:rPr>
                 <w:rStyle w:val="Lienhypertexte"/>
@@ -4830,7 +4847,7 @@
                 <w:noProof/>
                 <w:webHidden/>
               </w:rPr>
-              <w:instrText xml:space="preserve"> PAGEREF _Toc227918573 \h </w:instrText>
+              <w:instrText xml:space="preserve"> PAGEREF _Toc227923065 \h </w:instrText>
             </w:r>
             <w:r>
               <w:rPr>
@@ -4876,7 +4893,7 @@
               <w14:ligatures w14:val="standardContextual"/>
             </w:rPr>
           </w:pPr>
-          <w:hyperlink w:anchor="_Toc227918574" w:history="1">
+          <w:hyperlink w:anchor="_Toc227923066" w:history="1">
             <w:r>
               <w:rPr>
                 <w:rStyle w:val="Lienhypertexte"/>
@@ -4903,7 +4920,7 @@
                 <w:noProof/>
                 <w:webHidden/>
               </w:rPr>
-              <w:instrText xml:space="preserve"> PAGEREF _Toc227918574 \h </w:instrText>
+              <w:instrText xml:space="preserve"> PAGEREF _Toc227923066 \h </w:instrText>
             </w:r>
             <w:r>
               <w:rPr>
@@ -4923,7 +4940,7 @@
                 <w:noProof/>
                 <w:webHidden/>
               </w:rPr>
-              <w:t>22</w:t>
+              <w:t>23</w:t>
             </w:r>
             <w:r>
               <w:rPr>
@@ -4949,7 +4966,7 @@
               <w14:ligatures w14:val="standardContextual"/>
             </w:rPr>
           </w:pPr>
-          <w:hyperlink w:anchor="_Toc227918575" w:history="1">
+          <w:hyperlink w:anchor="_Toc227923067" w:history="1">
             <w:r>
               <w:rPr>
                 <w:rStyle w:val="Lienhypertexte"/>
@@ -4976,7 +4993,7 @@
                 <w:noProof/>
                 <w:webHidden/>
               </w:rPr>
-              <w:instrText xml:space="preserve"> PAGEREF _Toc227918575 \h </w:instrText>
+              <w:instrText xml:space="preserve"> PAGEREF _Toc227923067 \h </w:instrText>
             </w:r>
             <w:r>
               <w:rPr>
@@ -5053,7 +5070,7 @@
         </w:pBdr>
         <w:shd w:val="clear" w:color="auto" w:fill="1F4E79"/>
       </w:pPr>
-      <w:bookmarkStart w:id="0" w:name="_Toc227918514"/>
+      <w:bookmarkStart w:id="0" w:name="_Toc227923006"/>
       <w:r>
         <w:t>1. Introduction et Contexte du Projet</w:t>
       </w:r>
@@ -5071,7 +5088,7 @@
           <w:bottom w:val="single" w:sz="4" w:space="1" w:color="2E75B6"/>
         </w:pBdr>
       </w:pPr>
-      <w:bookmarkStart w:id="1" w:name="_Toc227918515"/>
+      <w:bookmarkStart w:id="1" w:name="_Toc227923007"/>
       <w:r>
         <w:t xml:space="preserve">1.1 Problématique : le Varroa </w:t>
       </w:r>
@@ -5277,7 +5294,7 @@
           <w:bottom w:val="single" w:sz="4" w:space="1" w:color="2E75B6"/>
         </w:pBdr>
       </w:pPr>
-      <w:bookmarkStart w:id="2" w:name="_Toc227918516"/>
+      <w:bookmarkStart w:id="2" w:name="_Toc227923008"/>
       <w:r>
         <w:t>1.2 Présentation du Projet</w:t>
       </w:r>
@@ -5319,7 +5336,7 @@
           <w:bottom w:val="single" w:sz="4" w:space="1" w:color="2E75B6"/>
         </w:pBdr>
       </w:pPr>
-      <w:bookmarkStart w:id="3" w:name="_Toc227918517"/>
+      <w:bookmarkStart w:id="3" w:name="_Toc227923009"/>
       <w:r>
         <w:t>1.3 Équipe et Organisation</w:t>
       </w:r>
@@ -5427,7 +5444,7 @@
           <w:bottom w:val="single" w:sz="4" w:space="1" w:color="2E75B6"/>
         </w:pBdr>
       </w:pPr>
-      <w:bookmarkStart w:id="4" w:name="_Toc227918518"/>
+      <w:bookmarkStart w:id="4" w:name="_Toc227923010"/>
       <w:r>
         <w:t>1.4 Cahier des Charges</w:t>
       </w:r>
@@ -5473,12 +5490,6 @@
         <w:gridCol w:w="1726"/>
       </w:tblGrid>
       <w:tr>
-        <w:tblPrEx>
-          <w:tblCellMar>
-            <w:top w:w="0" w:type="dxa"/>
-            <w:bottom w:w="0" w:type="dxa"/>
-          </w:tblCellMar>
-        </w:tblPrEx>
         <w:trPr>
           <w:tblHeader/>
         </w:trPr>
@@ -5583,12 +5594,6 @@
         </w:tc>
       </w:tr>
       <w:tr>
-        <w:tblPrEx>
-          <w:tblCellMar>
-            <w:top w:w="0" w:type="dxa"/>
-            <w:bottom w:w="0" w:type="dxa"/>
-          </w:tblCellMar>
-        </w:tblPrEx>
         <w:tc>
           <w:tcPr>
             <w:tcW w:w="3500" w:type="dxa"/>
@@ -5675,12 +5680,6 @@
         </w:tc>
       </w:tr>
       <w:tr>
-        <w:tblPrEx>
-          <w:tblCellMar>
-            <w:top w:w="0" w:type="dxa"/>
-            <w:bottom w:w="0" w:type="dxa"/>
-          </w:tblCellMar>
-        </w:tblPrEx>
         <w:tc>
           <w:tcPr>
             <w:tcW w:w="3500" w:type="dxa"/>
@@ -5767,12 +5766,6 @@
         </w:tc>
       </w:tr>
       <w:tr>
-        <w:tblPrEx>
-          <w:tblCellMar>
-            <w:top w:w="0" w:type="dxa"/>
-            <w:bottom w:w="0" w:type="dxa"/>
-          </w:tblCellMar>
-        </w:tblPrEx>
         <w:tc>
           <w:tcPr>
             <w:tcW w:w="3500" w:type="dxa"/>
@@ -5859,12 +5852,6 @@
         </w:tc>
       </w:tr>
       <w:tr>
-        <w:tblPrEx>
-          <w:tblCellMar>
-            <w:top w:w="0" w:type="dxa"/>
-            <w:bottom w:w="0" w:type="dxa"/>
-          </w:tblCellMar>
-        </w:tblPrEx>
         <w:tc>
           <w:tcPr>
             <w:tcW w:w="3500" w:type="dxa"/>
@@ -5951,12 +5938,6 @@
         </w:tc>
       </w:tr>
       <w:tr>
-        <w:tblPrEx>
-          <w:tblCellMar>
-            <w:top w:w="0" w:type="dxa"/>
-            <w:bottom w:w="0" w:type="dxa"/>
-          </w:tblCellMar>
-        </w:tblPrEx>
         <w:tc>
           <w:tcPr>
             <w:tcW w:w="3500" w:type="dxa"/>
@@ -6043,12 +6024,6 @@
         </w:tc>
       </w:tr>
       <w:tr>
-        <w:tblPrEx>
-          <w:tblCellMar>
-            <w:top w:w="0" w:type="dxa"/>
-            <w:bottom w:w="0" w:type="dxa"/>
-          </w:tblCellMar>
-        </w:tblPrEx>
         <w:tc>
           <w:tcPr>
             <w:tcW w:w="3500" w:type="dxa"/>
@@ -6155,7 +6130,7 @@
         </w:pBdr>
         <w:shd w:val="clear" w:color="auto" w:fill="1F4E79"/>
       </w:pPr>
-      <w:bookmarkStart w:id="5" w:name="_Toc227918519"/>
+      <w:bookmarkStart w:id="5" w:name="_Toc227923011"/>
       <w:r>
         <w:lastRenderedPageBreak/>
         <w:t>2. Architecture Générale du Système</w:t>
@@ -6174,7 +6149,7 @@
           <w:bottom w:val="single" w:sz="4" w:space="1" w:color="2E75B6"/>
         </w:pBdr>
       </w:pPr>
-      <w:bookmarkStart w:id="6" w:name="_Toc227918520"/>
+      <w:bookmarkStart w:id="6" w:name="_Toc227923012"/>
       <w:r>
         <w:t>2.1 Vue d'ensemble</w:t>
       </w:r>
@@ -6236,6 +6211,9 @@
         <w:spacing w:before="80" w:after="80"/>
       </w:pPr>
       <w:r>
+        <w:rPr>
+          <w:noProof/>
+        </w:rPr>
         <w:drawing>
           <wp:inline distT="0" distB="0" distL="0" distR="0" wp14:anchorId="4424AD23" wp14:editId="7FA00A57">
             <wp:extent cx="6188710" cy="2894965"/>
@@ -6285,7 +6263,7 @@
           <w:bottom w:val="single" w:sz="4" w:space="1" w:color="2E75B6"/>
         </w:pBdr>
       </w:pPr>
-      <w:bookmarkStart w:id="7" w:name="_Toc227918521"/>
+      <w:bookmarkStart w:id="7" w:name="_Toc227923013"/>
       <w:r>
         <w:t>2.2 Architecture Matérielle</w:t>
       </w:r>
@@ -6295,7 +6273,7 @@
       <w:pPr>
         <w:pStyle w:val="Titre3"/>
       </w:pPr>
-      <w:bookmarkStart w:id="8" w:name="_Toc227918522"/>
+      <w:bookmarkStart w:id="8" w:name="_Toc227923014"/>
       <w:r>
         <w:t>2.2.1 Le microcontrôleur ESP32</w:t>
       </w:r>
@@ -6472,12 +6450,6 @@
         <w:gridCol w:w="3326"/>
       </w:tblGrid>
       <w:tr>
-        <w:tblPrEx>
-          <w:tblCellMar>
-            <w:top w:w="0" w:type="dxa"/>
-            <w:bottom w:w="0" w:type="dxa"/>
-          </w:tblCellMar>
-        </w:tblPrEx>
         <w:trPr>
           <w:tblHeader/>
         </w:trPr>
@@ -6582,12 +6554,6 @@
         </w:tc>
       </w:tr>
       <w:tr>
-        <w:tblPrEx>
-          <w:tblCellMar>
-            <w:top w:w="0" w:type="dxa"/>
-            <w:bottom w:w="0" w:type="dxa"/>
-          </w:tblCellMar>
-        </w:tblPrEx>
         <w:tc>
           <w:tcPr>
             <w:tcW w:w="2500" w:type="dxa"/>
@@ -6692,12 +6658,6 @@
         </w:tc>
       </w:tr>
       <w:tr>
-        <w:tblPrEx>
-          <w:tblCellMar>
-            <w:top w:w="0" w:type="dxa"/>
-            <w:bottom w:w="0" w:type="dxa"/>
-          </w:tblCellMar>
-        </w:tblPrEx>
         <w:tc>
           <w:tcPr>
             <w:tcW w:w="2500" w:type="dxa"/>
@@ -6802,12 +6762,6 @@
         </w:tc>
       </w:tr>
       <w:tr>
-        <w:tblPrEx>
-          <w:tblCellMar>
-            <w:top w:w="0" w:type="dxa"/>
-            <w:bottom w:w="0" w:type="dxa"/>
-          </w:tblCellMar>
-        </w:tblPrEx>
         <w:tc>
           <w:tcPr>
             <w:tcW w:w="2500" w:type="dxa"/>
@@ -6912,12 +6866,6 @@
         </w:tc>
       </w:tr>
       <w:tr>
-        <w:tblPrEx>
-          <w:tblCellMar>
-            <w:top w:w="0" w:type="dxa"/>
-            <w:bottom w:w="0" w:type="dxa"/>
-          </w:tblCellMar>
-        </w:tblPrEx>
         <w:tc>
           <w:tcPr>
             <w:tcW w:w="2500" w:type="dxa"/>
@@ -7004,12 +6952,6 @@
         </w:tc>
       </w:tr>
       <w:tr>
-        <w:tblPrEx>
-          <w:tblCellMar>
-            <w:top w:w="0" w:type="dxa"/>
-            <w:bottom w:w="0" w:type="dxa"/>
-          </w:tblCellMar>
-        </w:tblPrEx>
         <w:tc>
           <w:tcPr>
             <w:tcW w:w="2500" w:type="dxa"/>
@@ -7096,12 +7038,6 @@
         </w:tc>
       </w:tr>
       <w:tr>
-        <w:tblPrEx>
-          <w:tblCellMar>
-            <w:top w:w="0" w:type="dxa"/>
-            <w:bottom w:w="0" w:type="dxa"/>
-          </w:tblCellMar>
-        </w:tblPrEx>
         <w:tc>
           <w:tcPr>
             <w:tcW w:w="2500" w:type="dxa"/>
@@ -7188,12 +7124,6 @@
         </w:tc>
       </w:tr>
       <w:tr>
-        <w:tblPrEx>
-          <w:tblCellMar>
-            <w:top w:w="0" w:type="dxa"/>
-            <w:bottom w:w="0" w:type="dxa"/>
-          </w:tblCellMar>
-        </w:tblPrEx>
         <w:tc>
           <w:tcPr>
             <w:tcW w:w="2500" w:type="dxa"/>
@@ -7289,7 +7219,7 @@
       <w:pPr>
         <w:pStyle w:val="Titre3"/>
       </w:pPr>
-      <w:bookmarkStart w:id="9" w:name="_Toc227918523"/>
+      <w:bookmarkStart w:id="9" w:name="_Toc227923015"/>
       <w:r>
         <w:t>2.2.2 Capteurs de Température DS18B20</w:t>
       </w:r>
@@ -7370,7 +7300,7 @@
       <w:pPr>
         <w:pStyle w:val="Titre3"/>
       </w:pPr>
-      <w:bookmarkStart w:id="10" w:name="_Toc227918524"/>
+      <w:bookmarkStart w:id="10" w:name="_Toc227923016"/>
       <w:r>
         <w:t>2.2.3 Résistances Chauffantes et Ventilateurs</w:t>
       </w:r>
@@ -7394,6 +7324,9 @@
         <w:jc w:val="center"/>
       </w:pPr>
       <w:r>
+        <w:rPr>
+          <w:noProof/>
+        </w:rPr>
         <w:drawing>
           <wp:inline distT="0" distB="0" distL="0" distR="0" wp14:anchorId="40A54C26" wp14:editId="293F49CD">
             <wp:extent cx="2520315" cy="3361812"/>
@@ -7471,7 +7404,7 @@
           <w:bottom w:val="single" w:sz="4" w:space="1" w:color="2E75B6"/>
         </w:pBdr>
       </w:pPr>
-      <w:bookmarkStart w:id="11" w:name="_Toc227918525"/>
+      <w:bookmarkStart w:id="11" w:name="_Toc227923017"/>
       <w:r>
         <w:t>2.3 Architecture Logicielle</w:t>
       </w:r>
@@ -7481,7 +7414,7 @@
       <w:pPr>
         <w:pStyle w:val="Titre3"/>
       </w:pPr>
-      <w:bookmarkStart w:id="12" w:name="_Toc227918526"/>
+      <w:bookmarkStart w:id="12" w:name="_Toc227923018"/>
       <w:r>
         <w:t>2.3.1 Organisation du Code Embarqué (ESP32 Principal)</w:t>
       </w:r>
@@ -7737,6 +7670,9 @@
         <w:jc w:val="center"/>
       </w:pPr>
       <w:r>
+        <w:rPr>
+          <w:noProof/>
+        </w:rPr>
         <w:drawing>
           <wp:inline distT="0" distB="0" distL="0" distR="0" wp14:anchorId="3B9A8829" wp14:editId="1F05166B">
             <wp:extent cx="4493791" cy="5562600"/>
@@ -7790,7 +7726,7 @@
       <w:pPr>
         <w:pStyle w:val="Titre3"/>
       </w:pPr>
-      <w:bookmarkStart w:id="13" w:name="_Toc227918527"/>
+      <w:bookmarkStart w:id="13" w:name="_Toc227923019"/>
       <w:r>
         <w:t>2.3.2 Architecture de l'Écran TFT (ESP32 Secondaire)</w:t>
       </w:r>
@@ -7858,177 +7794,45 @@
     <w:p>
       <w:pPr>
         <w:spacing w:before="80" w:after="80"/>
-      </w:pPr>
-    </w:p>
-    <w:p>
-      <w:pPr>
-        <w:pBdr>
-          <w:top w:val="single" w:sz="2" w:space="0" w:color="D9D9D9"/>
-          <w:bottom w:val="single" w:sz="2" w:space="0" w:color="D9D9D9"/>
-        </w:pBdr>
-        <w:shd w:val="clear" w:color="auto" w:fill="F2F2F2"/>
-        <w:spacing w:before="120" w:after="120"/>
         <w:jc w:val="center"/>
       </w:pPr>
-      <w:proofErr w:type="gramStart"/>
-      <w:r>
-        <w:rPr>
-          <w:i/>
-          <w:iCs/>
-          <w:color w:val="888888"/>
-          <w:sz w:val="21"/>
-          <w:szCs w:val="21"/>
-        </w:rPr>
-        <w:t>[ INSÉRER</w:t>
-      </w:r>
-      <w:proofErr w:type="gramEnd"/>
-      <w:r>
-        <w:rPr>
-          <w:i/>
-          <w:iCs/>
-          <w:color w:val="888888"/>
-          <w:sz w:val="21"/>
-          <w:szCs w:val="21"/>
-        </w:rPr>
-        <w:t xml:space="preserve"> ICI : </w:t>
-      </w:r>
-      <w:r>
-        <w:rPr>
-          <w:i/>
-          <w:iCs/>
-          <w:color w:val="888888"/>
-          <w:sz w:val="21"/>
-          <w:szCs w:val="21"/>
-        </w:rPr>
-        <w:t xml:space="preserve">SCHEMA CODE </w:t>
-      </w:r>
-      <w:proofErr w:type="gramStart"/>
-      <w:r>
-        <w:rPr>
-          <w:i/>
-          <w:iCs/>
-          <w:color w:val="888888"/>
-          <w:sz w:val="21"/>
-          <w:szCs w:val="21"/>
-        </w:rPr>
-        <w:t xml:space="preserve">ECRAN </w:t>
-      </w:r>
-      <w:r>
-        <w:rPr>
-          <w:i/>
-          <w:iCs/>
-          <w:color w:val="888888"/>
-          <w:sz w:val="21"/>
-          <w:szCs w:val="21"/>
-        </w:rPr>
-        <w:t xml:space="preserve"> ]</w:t>
-      </w:r>
-      <w:proofErr w:type="gramEnd"/>
-    </w:p>
-    <w:p>
-      <w:pPr>
-        <w:spacing w:before="80" w:after="80"/>
-      </w:pPr>
-    </w:p>
-    <w:p>
-      <w:pPr>
-        <w:spacing w:before="80" w:after="80"/>
-      </w:pPr>
-    </w:p>
-    <w:p>
-      <w:pPr>
-        <w:spacing w:before="80" w:after="80"/>
-      </w:pPr>
-    </w:p>
-    <w:p>
-      <w:pPr>
-        <w:spacing w:before="80" w:after="80"/>
-      </w:pPr>
-    </w:p>
-    <w:p>
-      <w:pPr>
-        <w:spacing w:before="80" w:after="80"/>
-      </w:pPr>
-    </w:p>
-    <w:p>
-      <w:pPr>
-        <w:spacing w:before="80" w:after="80"/>
-      </w:pPr>
-    </w:p>
-    <w:p>
-      <w:pPr>
-        <w:spacing w:before="80" w:after="80"/>
-      </w:pPr>
-    </w:p>
-    <w:p>
-      <w:pPr>
-        <w:spacing w:before="80" w:after="80"/>
-      </w:pPr>
-    </w:p>
-    <w:p>
-      <w:pPr>
-        <w:spacing w:before="80" w:after="80"/>
-      </w:pPr>
-    </w:p>
-    <w:p>
-      <w:pPr>
-        <w:spacing w:before="80" w:after="80"/>
-      </w:pPr>
-    </w:p>
-    <w:p>
-      <w:pPr>
-        <w:spacing w:before="80" w:after="80"/>
-      </w:pPr>
-    </w:p>
-    <w:p>
-      <w:pPr>
-        <w:spacing w:before="80" w:after="80"/>
-      </w:pPr>
-    </w:p>
-    <w:p>
-      <w:pPr>
-        <w:spacing w:before="80" w:after="80"/>
-      </w:pPr>
-    </w:p>
-    <w:p>
-      <w:pPr>
-        <w:spacing w:before="80" w:after="80"/>
-      </w:pPr>
-    </w:p>
-    <w:p>
-      <w:pPr>
-        <w:spacing w:before="80" w:after="80"/>
-      </w:pPr>
-    </w:p>
-    <w:p>
-      <w:pPr>
-        <w:spacing w:before="80" w:after="80"/>
-      </w:pPr>
-    </w:p>
-    <w:p>
-      <w:pPr>
-        <w:spacing w:before="80" w:after="80"/>
-      </w:pPr>
-    </w:p>
-    <w:p>
-      <w:pPr>
-        <w:spacing w:before="80" w:after="80"/>
-      </w:pPr>
-    </w:p>
-    <w:p>
-      <w:pPr>
-        <w:spacing w:before="80" w:after="80"/>
-      </w:pPr>
-    </w:p>
-    <w:p>
-      <w:pPr>
-        <w:spacing w:before="80" w:after="80"/>
-      </w:pPr>
-    </w:p>
-    <w:p>
-      <w:pPr>
-        <w:spacing w:before="80" w:after="80"/>
-      </w:pPr>
+      <w:r>
+        <w:drawing>
+          <wp:inline distT="0" distB="0" distL="0" distR="0" wp14:anchorId="79CC91DF" wp14:editId="38051225">
+            <wp:extent cx="5687219" cy="4963218"/>
+            <wp:effectExtent l="0" t="0" r="8890" b="8890"/>
+            <wp:docPr id="1017099873" name="Image 1"/>
+            <wp:cNvGraphicFramePr>
+              <a:graphicFrameLocks xmlns:a="http://schemas.openxmlformats.org/drawingml/2006/main" noChangeAspect="1"/>
+            </wp:cNvGraphicFramePr>
+            <a:graphic xmlns:a="http://schemas.openxmlformats.org/drawingml/2006/main">
+              <a:graphicData uri="http://schemas.openxmlformats.org/drawingml/2006/picture">
+                <pic:pic xmlns:pic="http://schemas.openxmlformats.org/drawingml/2006/picture">
+                  <pic:nvPicPr>
+                    <pic:cNvPr id="1017099873" name=""/>
+                    <pic:cNvPicPr/>
+                  </pic:nvPicPr>
+                  <pic:blipFill>
+                    <a:blip r:embed="rId13"/>
+                    <a:stretch>
+                      <a:fillRect/>
+                    </a:stretch>
+                  </pic:blipFill>
+                  <pic:spPr>
+                    <a:xfrm>
+                      <a:off x="0" y="0"/>
+                      <a:ext cx="5687219" cy="4963218"/>
+                    </a:xfrm>
+                    <a:prstGeom prst="rect">
+                      <a:avLst/>
+                    </a:prstGeom>
+                  </pic:spPr>
+                </pic:pic>
+              </a:graphicData>
+            </a:graphic>
+          </wp:inline>
+        </w:drawing>
+      </w:r>
     </w:p>
     <w:p>
       <w:pPr>
@@ -8103,7 +7907,7 @@
         </w:pBdr>
         <w:shd w:val="clear" w:color="auto" w:fill="1F4E79"/>
       </w:pPr>
-      <w:bookmarkStart w:id="14" w:name="_Toc227918528"/>
+      <w:bookmarkStart w:id="14" w:name="_Toc227923020"/>
       <w:r>
         <w:lastRenderedPageBreak/>
         <w:t>3. Conception et Réalisation du PCB</w:t>
@@ -8122,7 +7926,7 @@
           <w:bottom w:val="single" w:sz="4" w:space="1" w:color="2E75B6"/>
         </w:pBdr>
       </w:pPr>
-      <w:bookmarkStart w:id="15" w:name="_Toc227918529"/>
+      <w:bookmarkStart w:id="15" w:name="_Toc227923021"/>
       <w:r>
         <w:t>3.1 Analyse du PCB Existant</w:t>
       </w:r>
@@ -8164,7 +7968,7 @@
           <w:bottom w:val="single" w:sz="4" w:space="1" w:color="2E75B6"/>
         </w:pBdr>
       </w:pPr>
-      <w:bookmarkStart w:id="16" w:name="_Toc227918530"/>
+      <w:bookmarkStart w:id="16" w:name="_Toc227923022"/>
       <w:r>
         <w:t>3.2 Schéma Électronique</w:t>
       </w:r>
@@ -8192,6 +7996,9 @@
         <w:spacing w:before="80" w:after="80"/>
       </w:pPr>
       <w:r>
+        <w:rPr>
+          <w:noProof/>
+        </w:rPr>
         <w:drawing>
           <wp:inline distT="0" distB="0" distL="0" distR="0" wp14:anchorId="2E65BD7B" wp14:editId="469B7E96">
             <wp:extent cx="6188710" cy="4246245"/>
@@ -8210,7 +8017,7 @@
                     </pic:cNvPicPr>
                   </pic:nvPicPr>
                   <pic:blipFill>
-                    <a:blip r:embed="rId13">
+                    <a:blip r:embed="rId14">
                       <a:extLst>
                         <a:ext uri="{28A0092B-C50C-407E-A947-70E740481C1C}">
                           <a14:useLocalDpi xmlns:a14="http://schemas.microsoft.com/office/drawing/2010/main" val="0"/>
@@ -8264,7 +8071,7 @@
           <w:bottom w:val="single" w:sz="4" w:space="1" w:color="2E75B6"/>
         </w:pBdr>
       </w:pPr>
-      <w:bookmarkStart w:id="17" w:name="_Toc227918531"/>
+      <w:bookmarkStart w:id="17" w:name="_Toc227923023"/>
       <w:r>
         <w:t>3.3 Composants Critiques et Incidents Matériels</w:t>
       </w:r>
@@ -8291,7 +8098,7 @@
       <w:pPr>
         <w:pStyle w:val="Titre3"/>
       </w:pPr>
-      <w:bookmarkStart w:id="18" w:name="_Toc227918532"/>
+      <w:bookmarkStart w:id="18" w:name="_Toc227923024"/>
       <w:r>
         <w:t>3.3.1 Transistors Grillés et Diodes Manquantes</w:t>
       </w:r>
@@ -8347,12 +8154,6 @@
         <w:gridCol w:w="9026"/>
       </w:tblGrid>
       <w:tr>
-        <w:tblPrEx>
-          <w:tblCellMar>
-            <w:top w:w="0" w:type="dxa"/>
-            <w:bottom w:w="0" w:type="dxa"/>
-          </w:tblCellMar>
-        </w:tblPrEx>
         <w:tc>
           <w:tcPr>
             <w:tcW w:w="9026" w:type="dxa"/>
@@ -8394,7 +8195,7 @@
       <w:pPr>
         <w:pStyle w:val="Titre3"/>
       </w:pPr>
-      <w:bookmarkStart w:id="19" w:name="_Toc227918533"/>
+      <w:bookmarkStart w:id="19" w:name="_Toc227923025"/>
       <w:r>
         <w:t>3.3.2 Composants Q5 et R6 Défectueux</w:t>
       </w:r>
@@ -8424,7 +8225,7 @@
           <w:bottom w:val="single" w:sz="4" w:space="1" w:color="2E75B6"/>
         </w:pBdr>
       </w:pPr>
-      <w:bookmarkStart w:id="20" w:name="_Toc227918534"/>
+      <w:bookmarkStart w:id="20" w:name="_Toc227923026"/>
       <w:r>
         <w:t>3.4 Câblage et Assemblage Mécanique</w:t>
       </w:r>
@@ -8513,6 +8314,9 @@
         <w:jc w:val="center"/>
       </w:pPr>
       <w:r>
+        <w:rPr>
+          <w:noProof/>
+        </w:rPr>
         <w:drawing>
           <wp:inline distT="0" distB="0" distL="0" distR="0" wp14:anchorId="07F8D4AC" wp14:editId="3E9F9764">
             <wp:extent cx="4019550" cy="3036663"/>
@@ -8531,7 +8335,7 @@
                     </pic:cNvPicPr>
                   </pic:nvPicPr>
                   <pic:blipFill rotWithShape="1">
-                    <a:blip r:embed="rId14" cstate="print">
+                    <a:blip r:embed="rId15" cstate="print">
                       <a:extLst>
                         <a:ext uri="{28A0092B-C50C-407E-A947-70E740481C1C}">
                           <a14:useLocalDpi xmlns:a14="http://schemas.microsoft.com/office/drawing/2010/main" val="0"/>
@@ -8580,7 +8384,7 @@
           <w:bottom w:val="single" w:sz="4" w:space="1" w:color="2E75B6"/>
         </w:pBdr>
       </w:pPr>
-      <w:bookmarkStart w:id="21" w:name="_Toc227918535"/>
+      <w:bookmarkStart w:id="21" w:name="_Toc227923027"/>
       <w:r>
         <w:t>3.5 Simulation sous Micro-Cap 12</w:t>
       </w:r>
@@ -8616,7 +8420,7 @@
         </w:pBdr>
         <w:shd w:val="clear" w:color="auto" w:fill="1F4E79"/>
       </w:pPr>
-      <w:bookmarkStart w:id="22" w:name="_Toc227918536"/>
+      <w:bookmarkStart w:id="22" w:name="_Toc227923028"/>
       <w:r>
         <w:lastRenderedPageBreak/>
         <w:t>4. Développement Logiciel Embarqué</w:t>
@@ -8635,7 +8439,7 @@
           <w:bottom w:val="single" w:sz="4" w:space="1" w:color="2E75B6"/>
         </w:pBdr>
       </w:pPr>
-      <w:bookmarkStart w:id="23" w:name="_Toc227918537"/>
+      <w:bookmarkStart w:id="23" w:name="_Toc227923029"/>
       <w:r>
         <w:t>4.1 Environnement de Développement</w:t>
       </w:r>
@@ -8693,7 +8497,7 @@
           <w:bottom w:val="single" w:sz="4" w:space="1" w:color="2E75B6"/>
         </w:pBdr>
       </w:pPr>
-      <w:bookmarkStart w:id="24" w:name="_Toc227918538"/>
+      <w:bookmarkStart w:id="24" w:name="_Toc227923030"/>
       <w:r>
         <w:t>4.2 Tests Unitaires</w:t>
       </w:r>
@@ -8739,12 +8543,6 @@
         <w:gridCol w:w="3226"/>
       </w:tblGrid>
       <w:tr>
-        <w:tblPrEx>
-          <w:tblCellMar>
-            <w:top w:w="0" w:type="dxa"/>
-            <w:bottom w:w="0" w:type="dxa"/>
-          </w:tblCellMar>
-        </w:tblPrEx>
         <w:trPr>
           <w:tblHeader/>
         </w:trPr>
@@ -8849,12 +8647,6 @@
         </w:tc>
       </w:tr>
       <w:tr>
-        <w:tblPrEx>
-          <w:tblCellMar>
-            <w:top w:w="0" w:type="dxa"/>
-            <w:bottom w:w="0" w:type="dxa"/>
-          </w:tblCellMar>
-        </w:tblPrEx>
         <w:tc>
           <w:tcPr>
             <w:tcW w:w="2800" w:type="dxa"/>
@@ -8941,12 +8733,6 @@
         </w:tc>
       </w:tr>
       <w:tr>
-        <w:tblPrEx>
-          <w:tblCellMar>
-            <w:top w:w="0" w:type="dxa"/>
-            <w:bottom w:w="0" w:type="dxa"/>
-          </w:tblCellMar>
-        </w:tblPrEx>
         <w:tc>
           <w:tcPr>
             <w:tcW w:w="2800" w:type="dxa"/>
@@ -9033,12 +8819,6 @@
         </w:tc>
       </w:tr>
       <w:tr>
-        <w:tblPrEx>
-          <w:tblCellMar>
-            <w:top w:w="0" w:type="dxa"/>
-            <w:bottom w:w="0" w:type="dxa"/>
-          </w:tblCellMar>
-        </w:tblPrEx>
         <w:tc>
           <w:tcPr>
             <w:tcW w:w="2800" w:type="dxa"/>
@@ -9125,12 +8905,6 @@
         </w:tc>
       </w:tr>
       <w:tr>
-        <w:tblPrEx>
-          <w:tblCellMar>
-            <w:top w:w="0" w:type="dxa"/>
-            <w:bottom w:w="0" w:type="dxa"/>
-          </w:tblCellMar>
-        </w:tblPrEx>
         <w:tc>
           <w:tcPr>
             <w:tcW w:w="2800" w:type="dxa"/>
@@ -9217,12 +8991,6 @@
         </w:tc>
       </w:tr>
       <w:tr>
-        <w:tblPrEx>
-          <w:tblCellMar>
-            <w:top w:w="0" w:type="dxa"/>
-            <w:bottom w:w="0" w:type="dxa"/>
-          </w:tblCellMar>
-        </w:tblPrEx>
         <w:tc>
           <w:tcPr>
             <w:tcW w:w="2800" w:type="dxa"/>
@@ -9309,12 +9077,6 @@
         </w:tc>
       </w:tr>
       <w:tr>
-        <w:tblPrEx>
-          <w:tblCellMar>
-            <w:top w:w="0" w:type="dxa"/>
-            <w:bottom w:w="0" w:type="dxa"/>
-          </w:tblCellMar>
-        </w:tblPrEx>
         <w:tc>
           <w:tcPr>
             <w:tcW w:w="2800" w:type="dxa"/>
@@ -9401,12 +9163,6 @@
         </w:tc>
       </w:tr>
       <w:tr>
-        <w:tblPrEx>
-          <w:tblCellMar>
-            <w:top w:w="0" w:type="dxa"/>
-            <w:bottom w:w="0" w:type="dxa"/>
-          </w:tblCellMar>
-        </w:tblPrEx>
         <w:tc>
           <w:tcPr>
             <w:tcW w:w="2800" w:type="dxa"/>
@@ -9505,7 +9261,7 @@
           <w:bottom w:val="single" w:sz="4" w:space="1" w:color="2E75B6"/>
         </w:pBdr>
       </w:pPr>
-      <w:bookmarkStart w:id="25" w:name="_Toc227918539"/>
+      <w:bookmarkStart w:id="25" w:name="_Toc227923031"/>
       <w:r>
         <w:t>4.3 Algorithme de Régulation Thermique</w:t>
       </w:r>
@@ -9515,7 +9271,7 @@
       <w:pPr>
         <w:pStyle w:val="Titre3"/>
       </w:pPr>
-      <w:bookmarkStart w:id="26" w:name="_Toc227918540"/>
+      <w:bookmarkStart w:id="26" w:name="_Toc227923032"/>
       <w:r>
         <w:t>4.3.1 Phase 1 : Régulation PID</w:t>
       </w:r>
@@ -9599,7 +9355,7 @@
       <w:pPr>
         <w:pStyle w:val="Titre3"/>
       </w:pPr>
-      <w:bookmarkStart w:id="27" w:name="_Toc227918541"/>
+      <w:bookmarkStart w:id="27" w:name="_Toc227923033"/>
       <w:r>
         <w:t>4.3.2 Phase 2 : Passage à la Régulation Tout-ou-Rien</w:t>
       </w:r>
@@ -9657,12 +9413,6 @@
         <w:gridCol w:w="9026"/>
       </w:tblGrid>
       <w:tr>
-        <w:tblPrEx>
-          <w:tblCellMar>
-            <w:top w:w="0" w:type="dxa"/>
-            <w:bottom w:w="0" w:type="dxa"/>
-          </w:tblCellMar>
-        </w:tblPrEx>
         <w:tc>
           <w:tcPr>
             <w:tcW w:w="9026" w:type="dxa"/>
@@ -10026,7 +9776,7 @@
           <w:bottom w:val="single" w:sz="4" w:space="1" w:color="2E75B6"/>
         </w:pBdr>
       </w:pPr>
-      <w:bookmarkStart w:id="28" w:name="_Toc227918542"/>
+      <w:bookmarkStart w:id="28" w:name="_Toc227923034"/>
       <w:r>
         <w:t xml:space="preserve">4.4 Gestion du Multitâche avec </w:t>
       </w:r>
@@ -10151,7 +9901,7 @@
           <w:bottom w:val="single" w:sz="4" w:space="1" w:color="2E75B6"/>
         </w:pBdr>
       </w:pPr>
-      <w:bookmarkStart w:id="29" w:name="_Toc227918543"/>
+      <w:bookmarkStart w:id="29" w:name="_Toc227923035"/>
       <w:r>
         <w:t>4.5 Persistance des Données en EEPROM</w:t>
       </w:r>
@@ -10195,7 +9945,7 @@
           <w:bottom w:val="single" w:sz="4" w:space="1" w:color="2E75B6"/>
         </w:pBdr>
       </w:pPr>
-      <w:bookmarkStart w:id="30" w:name="_Toc227918544"/>
+      <w:bookmarkStart w:id="30" w:name="_Toc227923036"/>
       <w:r>
         <w:t>4.6 Gestion des Erreurs de Capteurs</w:t>
       </w:r>
@@ -10318,7 +10068,7 @@
         </w:pBdr>
         <w:shd w:val="clear" w:color="auto" w:fill="1F4E79"/>
       </w:pPr>
-      <w:bookmarkStart w:id="31" w:name="_Toc227918545"/>
+      <w:bookmarkStart w:id="31" w:name="_Toc227923037"/>
       <w:r>
         <w:lastRenderedPageBreak/>
         <w:t>5. Interface de Supervision</w:t>
@@ -10332,7 +10082,7 @@
           <w:bottom w:val="single" w:sz="4" w:space="1" w:color="2E75B6"/>
         </w:pBdr>
       </w:pPr>
-      <w:bookmarkStart w:id="32" w:name="_Toc227918546"/>
+      <w:bookmarkStart w:id="32" w:name="_Toc227923038"/>
       <w:r>
         <w:t>5.1 Serveur Web Embarqué</w:t>
       </w:r>
@@ -10342,7 +10092,7 @@
       <w:pPr>
         <w:pStyle w:val="Titre3"/>
       </w:pPr>
-      <w:bookmarkStart w:id="33" w:name="_Toc227918547"/>
+      <w:bookmarkStart w:id="33" w:name="_Toc227923039"/>
       <w:r>
         <w:t>5.1.1 Mode Point d'Accès Wi-Fi</w:t>
       </w:r>
@@ -10417,7 +10167,7 @@
       <w:pPr>
         <w:pStyle w:val="Titre3"/>
       </w:pPr>
-      <w:bookmarkStart w:id="34" w:name="_Toc227918548"/>
+      <w:bookmarkStart w:id="34" w:name="_Toc227923040"/>
       <w:r>
         <w:t>5.1.2 Routes HTTP</w:t>
       </w:r>
@@ -10463,12 +10213,6 @@
         <w:gridCol w:w="5693"/>
       </w:tblGrid>
       <w:tr>
-        <w:tblPrEx>
-          <w:tblCellMar>
-            <w:top w:w="0" w:type="dxa"/>
-            <w:bottom w:w="0" w:type="dxa"/>
-          </w:tblCellMar>
-        </w:tblPrEx>
         <w:trPr>
           <w:tblHeader/>
         </w:trPr>
@@ -10573,12 +10317,6 @@
         </w:tc>
       </w:tr>
       <w:tr>
-        <w:tblPrEx>
-          <w:tblCellMar>
-            <w:top w:w="0" w:type="dxa"/>
-            <w:bottom w:w="0" w:type="dxa"/>
-          </w:tblCellMar>
-        </w:tblPrEx>
         <w:tc>
           <w:tcPr>
             <w:tcW w:w="1800" w:type="dxa"/>
@@ -10665,12 +10403,6 @@
         </w:tc>
       </w:tr>
       <w:tr>
-        <w:tblPrEx>
-          <w:tblCellMar>
-            <w:top w:w="0" w:type="dxa"/>
-            <w:bottom w:w="0" w:type="dxa"/>
-          </w:tblCellMar>
-        </w:tblPrEx>
         <w:tc>
           <w:tcPr>
             <w:tcW w:w="1800" w:type="dxa"/>
@@ -10767,12 +10499,6 @@
         </w:tc>
       </w:tr>
       <w:tr>
-        <w:tblPrEx>
-          <w:tblCellMar>
-            <w:top w:w="0" w:type="dxa"/>
-            <w:bottom w:w="0" w:type="dxa"/>
-          </w:tblCellMar>
-        </w:tblPrEx>
         <w:tc>
           <w:tcPr>
             <w:tcW w:w="1800" w:type="dxa"/>
@@ -10965,7 +10691,7 @@
       <w:pPr>
         <w:pStyle w:val="Titre3"/>
       </w:pPr>
-      <w:bookmarkStart w:id="35" w:name="_Toc227918549"/>
+      <w:bookmarkStart w:id="35" w:name="_Toc227923041"/>
       <w:r>
         <w:t>5.1.3 Interface Utilisateur Web</w:t>
       </w:r>
@@ -10989,6 +10715,9 @@
         <w:jc w:val="center"/>
       </w:pPr>
       <w:r>
+        <w:rPr>
+          <w:noProof/>
+        </w:rPr>
         <w:drawing>
           <wp:inline distT="0" distB="0" distL="0" distR="0" wp14:anchorId="3AF4C582" wp14:editId="641B45A8">
             <wp:extent cx="3158899" cy="2301240"/>
@@ -11005,7 +10734,7 @@
                     <pic:cNvPicPr/>
                   </pic:nvPicPr>
                   <pic:blipFill>
-                    <a:blip r:embed="rId15"/>
+                    <a:blip r:embed="rId16"/>
                     <a:stretch>
                       <a:fillRect/>
                     </a:stretch>
@@ -11033,7 +10762,7 @@
           <w:bottom w:val="single" w:sz="4" w:space="1" w:color="2E75B6"/>
         </w:pBdr>
       </w:pPr>
-      <w:bookmarkStart w:id="36" w:name="_Toc227918550"/>
+      <w:bookmarkStart w:id="36" w:name="_Toc227923042"/>
       <w:r>
         <w:lastRenderedPageBreak/>
         <w:t>5.2 Afficheur TFT Local</w:t>
@@ -11044,7 +10773,7 @@
       <w:pPr>
         <w:pStyle w:val="Titre3"/>
       </w:pPr>
-      <w:bookmarkStart w:id="37" w:name="_Toc227918551"/>
+      <w:bookmarkStart w:id="37" w:name="_Toc227923043"/>
       <w:r>
         <w:t>5.2.1 Matériel utilisé</w:t>
       </w:r>
@@ -11071,7 +10800,7 @@
       <w:pPr>
         <w:pStyle w:val="Titre3"/>
       </w:pPr>
-      <w:bookmarkStart w:id="38" w:name="_Toc227918552"/>
+      <w:bookmarkStart w:id="38" w:name="_Toc227923044"/>
       <w:r>
         <w:t>5.2.2 Développement de l'Interface</w:t>
       </w:r>
@@ -11107,6 +10836,9 @@
       <w:pPr>
         <w:spacing w:before="60" w:after="60"/>
         <w:jc w:val="both"/>
+        <w:rPr>
+          <w:color w:val="404040"/>
+        </w:rPr>
       </w:pPr>
       <w:r>
         <w:rPr>
@@ -11139,53 +10871,52 @@
     </w:p>
     <w:p>
       <w:pPr>
+        <w:spacing w:before="60" w:after="60"/>
+        <w:jc w:val="both"/>
+      </w:pPr>
+    </w:p>
+    <w:p>
+      <w:pPr>
         <w:spacing w:before="80" w:after="80"/>
-      </w:pPr>
-    </w:p>
-    <w:p>
-      <w:pPr>
-        <w:pBdr>
-          <w:top w:val="single" w:sz="2" w:space="0" w:color="D9D9D9"/>
-          <w:bottom w:val="single" w:sz="2" w:space="0" w:color="D9D9D9"/>
-        </w:pBdr>
-        <w:shd w:val="clear" w:color="auto" w:fill="F2F2F2"/>
-        <w:spacing w:before="120" w:after="120"/>
         <w:jc w:val="center"/>
       </w:pPr>
-      <w:proofErr w:type="gramStart"/>
-      <w:r>
-        <w:rPr>
-          <w:i/>
-          <w:iCs/>
-          <w:color w:val="888888"/>
-          <w:sz w:val="21"/>
-          <w:szCs w:val="21"/>
-        </w:rPr>
-        <w:t>[ INSÉRER</w:t>
-      </w:r>
-      <w:proofErr w:type="gramEnd"/>
-      <w:r>
-        <w:rPr>
-          <w:i/>
-          <w:iCs/>
-          <w:color w:val="888888"/>
-          <w:sz w:val="21"/>
-          <w:szCs w:val="21"/>
-        </w:rPr>
-        <w:t xml:space="preserve"> ICI : Photo de l'écran TFT intégré à la maquette en </w:t>
-      </w:r>
-      <w:proofErr w:type="gramStart"/>
-      <w:r>
-        <w:rPr>
-          <w:i/>
-          <w:iCs/>
-          <w:color w:val="888888"/>
-          <w:sz w:val="21"/>
-          <w:szCs w:val="21"/>
-        </w:rPr>
-        <w:t>fonctionnement ]</w:t>
-      </w:r>
-      <w:proofErr w:type="gramEnd"/>
+      <w:r>
+        <w:drawing>
+          <wp:inline distT="0" distB="0" distL="0" distR="0" wp14:anchorId="3CB40367" wp14:editId="60F34941">
+            <wp:extent cx="4229690" cy="2753109"/>
+            <wp:effectExtent l="0" t="0" r="0" b="9525"/>
+            <wp:docPr id="1806550492" name="Image 1"/>
+            <wp:cNvGraphicFramePr>
+              <a:graphicFrameLocks xmlns:a="http://schemas.openxmlformats.org/drawingml/2006/main" noChangeAspect="1"/>
+            </wp:cNvGraphicFramePr>
+            <a:graphic xmlns:a="http://schemas.openxmlformats.org/drawingml/2006/main">
+              <a:graphicData uri="http://schemas.openxmlformats.org/drawingml/2006/picture">
+                <pic:pic xmlns:pic="http://schemas.openxmlformats.org/drawingml/2006/picture">
+                  <pic:nvPicPr>
+                    <pic:cNvPr id="1806550492" name=""/>
+                    <pic:cNvPicPr/>
+                  </pic:nvPicPr>
+                  <pic:blipFill>
+                    <a:blip r:embed="rId17"/>
+                    <a:stretch>
+                      <a:fillRect/>
+                    </a:stretch>
+                  </pic:blipFill>
+                  <pic:spPr>
+                    <a:xfrm>
+                      <a:off x="0" y="0"/>
+                      <a:ext cx="4229690" cy="2753109"/>
+                    </a:xfrm>
+                    <a:prstGeom prst="rect">
+                      <a:avLst/>
+                    </a:prstGeom>
+                  </pic:spPr>
+                </pic:pic>
+              </a:graphicData>
+            </a:graphic>
+          </wp:inline>
+        </w:drawing>
+      </w:r>
     </w:p>
     <w:p>
       <w:pPr>
@@ -11196,7 +10927,7 @@
       <w:pPr>
         <w:pStyle w:val="Titre3"/>
       </w:pPr>
-      <w:bookmarkStart w:id="39" w:name="_Toc227918553"/>
+      <w:bookmarkStart w:id="39" w:name="_Toc227923045"/>
       <w:r>
         <w:t>5.2.3 Problèmes Rencontrés et Solutions</w:t>
       </w:r>
@@ -11244,7 +10975,7 @@
         </w:pBdr>
         <w:shd w:val="clear" w:color="auto" w:fill="1F4E79"/>
       </w:pPr>
-      <w:bookmarkStart w:id="40" w:name="_Toc227918554"/>
+      <w:bookmarkStart w:id="40" w:name="_Toc227923046"/>
       <w:r>
         <w:lastRenderedPageBreak/>
         <w:t>6. Problèmes Rencontrés et Solutions Apportées</w:t>
@@ -11270,7 +11001,7 @@
           <w:bottom w:val="single" w:sz="4" w:space="1" w:color="2E75B6"/>
         </w:pBdr>
       </w:pPr>
-      <w:bookmarkStart w:id="41" w:name="_Toc227918555"/>
+      <w:bookmarkStart w:id="41" w:name="_Toc227923047"/>
       <w:r>
         <w:t>6.1 Problèmes Matériels</w:t>
       </w:r>
@@ -11304,12 +11035,6 @@
         <w:gridCol w:w="3226"/>
       </w:tblGrid>
       <w:tr>
-        <w:tblPrEx>
-          <w:tblCellMar>
-            <w:top w:w="0" w:type="dxa"/>
-            <w:bottom w:w="0" w:type="dxa"/>
-          </w:tblCellMar>
-        </w:tblPrEx>
         <w:trPr>
           <w:tblHeader/>
         </w:trPr>
@@ -11414,12 +11139,6 @@
         </w:tc>
       </w:tr>
       <w:tr>
-        <w:tblPrEx>
-          <w:tblCellMar>
-            <w:top w:w="0" w:type="dxa"/>
-            <w:bottom w:w="0" w:type="dxa"/>
-          </w:tblCellMar>
-        </w:tblPrEx>
         <w:tc>
           <w:tcPr>
             <w:tcW w:w="2600" w:type="dxa"/>
@@ -11506,12 +11225,6 @@
         </w:tc>
       </w:tr>
       <w:tr>
-        <w:tblPrEx>
-          <w:tblCellMar>
-            <w:top w:w="0" w:type="dxa"/>
-            <w:bottom w:w="0" w:type="dxa"/>
-          </w:tblCellMar>
-        </w:tblPrEx>
         <w:tc>
           <w:tcPr>
             <w:tcW w:w="2600" w:type="dxa"/>
@@ -11616,12 +11329,6 @@
         </w:tc>
       </w:tr>
       <w:tr>
-        <w:tblPrEx>
-          <w:tblCellMar>
-            <w:top w:w="0" w:type="dxa"/>
-            <w:bottom w:w="0" w:type="dxa"/>
-          </w:tblCellMar>
-        </w:tblPrEx>
         <w:tc>
           <w:tcPr>
             <w:tcW w:w="2600" w:type="dxa"/>
@@ -11708,12 +11415,6 @@
         </w:tc>
       </w:tr>
       <w:tr>
-        <w:tblPrEx>
-          <w:tblCellMar>
-            <w:top w:w="0" w:type="dxa"/>
-            <w:bottom w:w="0" w:type="dxa"/>
-          </w:tblCellMar>
-        </w:tblPrEx>
         <w:tc>
           <w:tcPr>
             <w:tcW w:w="2600" w:type="dxa"/>
@@ -11800,12 +11501,6 @@
         </w:tc>
       </w:tr>
       <w:tr>
-        <w:tblPrEx>
-          <w:tblCellMar>
-            <w:top w:w="0" w:type="dxa"/>
-            <w:bottom w:w="0" w:type="dxa"/>
-          </w:tblCellMar>
-        </w:tblPrEx>
         <w:tc>
           <w:tcPr>
             <w:tcW w:w="2600" w:type="dxa"/>
@@ -11892,12 +11587,6 @@
         </w:tc>
       </w:tr>
       <w:tr>
-        <w:tblPrEx>
-          <w:tblCellMar>
-            <w:top w:w="0" w:type="dxa"/>
-            <w:bottom w:w="0" w:type="dxa"/>
-          </w:tblCellMar>
-        </w:tblPrEx>
         <w:tc>
           <w:tcPr>
             <w:tcW w:w="2600" w:type="dxa"/>
@@ -11984,12 +11673,6 @@
         </w:tc>
       </w:tr>
       <w:tr>
-        <w:tblPrEx>
-          <w:tblCellMar>
-            <w:top w:w="0" w:type="dxa"/>
-            <w:bottom w:w="0" w:type="dxa"/>
-          </w:tblCellMar>
-        </w:tblPrEx>
         <w:tc>
           <w:tcPr>
             <w:tcW w:w="2600" w:type="dxa"/>
@@ -12088,7 +11771,7 @@
           <w:bottom w:val="single" w:sz="4" w:space="1" w:color="2E75B6"/>
         </w:pBdr>
       </w:pPr>
-      <w:bookmarkStart w:id="42" w:name="_Toc227918556"/>
+      <w:bookmarkStart w:id="42" w:name="_Toc227923048"/>
       <w:r>
         <w:t>6.2 Problème Majeur : Reset Intempestifs de l'ESP32</w:t>
       </w:r>
@@ -12115,7 +11798,7 @@
       <w:pPr>
         <w:pStyle w:val="Titre3"/>
       </w:pPr>
-      <w:bookmarkStart w:id="43" w:name="_Toc227918557"/>
+      <w:bookmarkStart w:id="43" w:name="_Toc227923049"/>
       <w:r>
         <w:t>6.2.1 Diagnostic</w:t>
       </w:r>
@@ -12301,7 +11984,7 @@
       <w:pPr>
         <w:pStyle w:val="Titre3"/>
       </w:pPr>
-      <w:bookmarkStart w:id="44" w:name="_Toc227918558"/>
+      <w:bookmarkStart w:id="44" w:name="_Toc227923050"/>
       <w:r>
         <w:t>6.2.2 Solutions Mises en Œuvre</w:t>
       </w:r>
@@ -12495,12 +12178,6 @@
         <w:gridCol w:w="9026"/>
       </w:tblGrid>
       <w:tr>
-        <w:tblPrEx>
-          <w:tblCellMar>
-            <w:top w:w="0" w:type="dxa"/>
-            <w:bottom w:w="0" w:type="dxa"/>
-          </w:tblCellMar>
-        </w:tblPrEx>
         <w:tc>
           <w:tcPr>
             <w:tcW w:w="9026" w:type="dxa"/>
@@ -12563,7 +12240,7 @@
           <w:bottom w:val="single" w:sz="4" w:space="1" w:color="2E75B6"/>
         </w:pBdr>
       </w:pPr>
-      <w:bookmarkStart w:id="45" w:name="_Toc227918559"/>
+      <w:bookmarkStart w:id="45" w:name="_Toc227923051"/>
       <w:r>
         <w:t>6.3 Problèmes Logiciels</w:t>
       </w:r>
@@ -12597,12 +12274,6 @@
         <w:gridCol w:w="3526"/>
       </w:tblGrid>
       <w:tr>
-        <w:tblPrEx>
-          <w:tblCellMar>
-            <w:top w:w="0" w:type="dxa"/>
-            <w:bottom w:w="0" w:type="dxa"/>
-          </w:tblCellMar>
-        </w:tblPrEx>
         <w:trPr>
           <w:tblHeader/>
         </w:trPr>
@@ -12707,12 +12378,6 @@
         </w:tc>
       </w:tr>
       <w:tr>
-        <w:tblPrEx>
-          <w:tblCellMar>
-            <w:top w:w="0" w:type="dxa"/>
-            <w:bottom w:w="0" w:type="dxa"/>
-          </w:tblCellMar>
-        </w:tblPrEx>
         <w:tc>
           <w:tcPr>
             <w:tcW w:w="2800" w:type="dxa"/>
@@ -12809,12 +12474,6 @@
         </w:tc>
       </w:tr>
       <w:tr>
-        <w:tblPrEx>
-          <w:tblCellMar>
-            <w:top w:w="0" w:type="dxa"/>
-            <w:bottom w:w="0" w:type="dxa"/>
-          </w:tblCellMar>
-        </w:tblPrEx>
         <w:tc>
           <w:tcPr>
             <w:tcW w:w="2800" w:type="dxa"/>
@@ -12911,12 +12570,6 @@
         </w:tc>
       </w:tr>
       <w:tr>
-        <w:tblPrEx>
-          <w:tblCellMar>
-            <w:top w:w="0" w:type="dxa"/>
-            <w:bottom w:w="0" w:type="dxa"/>
-          </w:tblCellMar>
-        </w:tblPrEx>
         <w:tc>
           <w:tcPr>
             <w:tcW w:w="2800" w:type="dxa"/>
@@ -13003,12 +12656,6 @@
         </w:tc>
       </w:tr>
       <w:tr>
-        <w:tblPrEx>
-          <w:tblCellMar>
-            <w:top w:w="0" w:type="dxa"/>
-            <w:bottom w:w="0" w:type="dxa"/>
-          </w:tblCellMar>
-        </w:tblPrEx>
         <w:tc>
           <w:tcPr>
             <w:tcW w:w="2800" w:type="dxa"/>
@@ -13113,12 +12760,6 @@
         </w:tc>
       </w:tr>
       <w:tr>
-        <w:tblPrEx>
-          <w:tblCellMar>
-            <w:top w:w="0" w:type="dxa"/>
-            <w:bottom w:w="0" w:type="dxa"/>
-          </w:tblCellMar>
-        </w:tblPrEx>
         <w:tc>
           <w:tcPr>
             <w:tcW w:w="2800" w:type="dxa"/>
@@ -13251,7 +12892,7 @@
         </w:pBdr>
         <w:shd w:val="clear" w:color="auto" w:fill="1F4E79"/>
       </w:pPr>
-      <w:bookmarkStart w:id="46" w:name="_Toc227918560"/>
+      <w:bookmarkStart w:id="46" w:name="_Toc227923052"/>
       <w:r>
         <w:lastRenderedPageBreak/>
         <w:t>7. Tests, Validation et Résultats</w:t>
@@ -13270,7 +12911,7 @@
           <w:bottom w:val="single" w:sz="4" w:space="1" w:color="2E75B6"/>
         </w:pBdr>
       </w:pPr>
-      <w:bookmarkStart w:id="47" w:name="_Toc227918561"/>
+      <w:bookmarkStart w:id="47" w:name="_Toc227923053"/>
       <w:r>
         <w:t>7.</w:t>
       </w:r>
@@ -13332,7 +12973,7 @@
           <w:bottom w:val="single" w:sz="4" w:space="1" w:color="2E75B6"/>
         </w:pBdr>
       </w:pPr>
-      <w:bookmarkStart w:id="48" w:name="_Toc227918562"/>
+      <w:bookmarkStart w:id="48" w:name="_Toc227923054"/>
       <w:r>
         <w:t>7.</w:t>
       </w:r>
@@ -13372,12 +13013,6 @@
         <w:gridCol w:w="2226"/>
       </w:tblGrid>
       <w:tr>
-        <w:tblPrEx>
-          <w:tblCellMar>
-            <w:top w:w="0" w:type="dxa"/>
-            <w:bottom w:w="0" w:type="dxa"/>
-          </w:tblCellMar>
-        </w:tblPrEx>
         <w:trPr>
           <w:tblHeader/>
         </w:trPr>
@@ -13482,12 +13117,6 @@
         </w:tc>
       </w:tr>
       <w:tr>
-        <w:tblPrEx>
-          <w:tblCellMar>
-            <w:top w:w="0" w:type="dxa"/>
-            <w:bottom w:w="0" w:type="dxa"/>
-          </w:tblCellMar>
-        </w:tblPrEx>
         <w:tc>
           <w:tcPr>
             <w:tcW w:w="3200" w:type="dxa"/>
@@ -13574,12 +13203,6 @@
         </w:tc>
       </w:tr>
       <w:tr>
-        <w:tblPrEx>
-          <w:tblCellMar>
-            <w:top w:w="0" w:type="dxa"/>
-            <w:bottom w:w="0" w:type="dxa"/>
-          </w:tblCellMar>
-        </w:tblPrEx>
         <w:tc>
           <w:tcPr>
             <w:tcW w:w="3200" w:type="dxa"/>
@@ -13666,12 +13289,6 @@
         </w:tc>
       </w:tr>
       <w:tr>
-        <w:tblPrEx>
-          <w:tblCellMar>
-            <w:top w:w="0" w:type="dxa"/>
-            <w:bottom w:w="0" w:type="dxa"/>
-          </w:tblCellMar>
-        </w:tblPrEx>
         <w:tc>
           <w:tcPr>
             <w:tcW w:w="3200" w:type="dxa"/>
@@ -13758,12 +13375,6 @@
         </w:tc>
       </w:tr>
       <w:tr>
-        <w:tblPrEx>
-          <w:tblCellMar>
-            <w:top w:w="0" w:type="dxa"/>
-            <w:bottom w:w="0" w:type="dxa"/>
-          </w:tblCellMar>
-        </w:tblPrEx>
         <w:tc>
           <w:tcPr>
             <w:tcW w:w="3200" w:type="dxa"/>
@@ -13850,12 +13461,6 @@
         </w:tc>
       </w:tr>
       <w:tr>
-        <w:tblPrEx>
-          <w:tblCellMar>
-            <w:top w:w="0" w:type="dxa"/>
-            <w:bottom w:w="0" w:type="dxa"/>
-          </w:tblCellMar>
-        </w:tblPrEx>
         <w:tc>
           <w:tcPr>
             <w:tcW w:w="3200" w:type="dxa"/>
@@ -13942,12 +13547,6 @@
         </w:tc>
       </w:tr>
       <w:tr>
-        <w:tblPrEx>
-          <w:tblCellMar>
-            <w:top w:w="0" w:type="dxa"/>
-            <w:bottom w:w="0" w:type="dxa"/>
-          </w:tblCellMar>
-        </w:tblPrEx>
         <w:tc>
           <w:tcPr>
             <w:tcW w:w="3200" w:type="dxa"/>
@@ -14034,12 +13633,6 @@
         </w:tc>
       </w:tr>
       <w:tr>
-        <w:tblPrEx>
-          <w:tblCellMar>
-            <w:top w:w="0" w:type="dxa"/>
-            <w:bottom w:w="0" w:type="dxa"/>
-          </w:tblCellMar>
-        </w:tblPrEx>
         <w:tc>
           <w:tcPr>
             <w:tcW w:w="3200" w:type="dxa"/>
@@ -14172,12 +13765,6 @@
         </w:tc>
       </w:tr>
       <w:tr>
-        <w:tblPrEx>
-          <w:tblCellMar>
-            <w:top w:w="0" w:type="dxa"/>
-            <w:bottom w:w="0" w:type="dxa"/>
-          </w:tblCellMar>
-        </w:tblPrEx>
         <w:tc>
           <w:tcPr>
             <w:tcW w:w="3200" w:type="dxa"/>
@@ -14282,7 +13869,7 @@
         </w:pBdr>
         <w:shd w:val="clear" w:color="auto" w:fill="1F4E79"/>
       </w:pPr>
-      <w:bookmarkStart w:id="49" w:name="_Toc227918563"/>
+      <w:bookmarkStart w:id="49" w:name="_Toc227923055"/>
       <w:r>
         <w:lastRenderedPageBreak/>
         <w:t>8. Retour d'Expérience et Perspectives</w:t>
@@ -14301,7 +13888,7 @@
           <w:bottom w:val="single" w:sz="4" w:space="1" w:color="2E75B6"/>
         </w:pBdr>
       </w:pPr>
-      <w:bookmarkStart w:id="50" w:name="_Toc227918564"/>
+      <w:bookmarkStart w:id="50" w:name="_Toc227923056"/>
       <w:r>
         <w:t>8.1 Compétences Développées</w:t>
       </w:r>
@@ -14328,7 +13915,7 @@
       <w:pPr>
         <w:pStyle w:val="Titre3"/>
       </w:pPr>
-      <w:bookmarkStart w:id="51" w:name="_Toc227918565"/>
+      <w:bookmarkStart w:id="51" w:name="_Toc227923057"/>
       <w:r>
         <w:t>8.1.1 Compétences Techniques</w:t>
       </w:r>
@@ -14481,7 +14068,7 @@
       <w:pPr>
         <w:pStyle w:val="Titre3"/>
       </w:pPr>
-      <w:bookmarkStart w:id="52" w:name="_Toc227918566"/>
+      <w:bookmarkStart w:id="52" w:name="_Toc227923058"/>
       <w:r>
         <w:t>8.1.2 Compétences Transversales</w:t>
       </w:r>
@@ -14577,7 +14164,7 @@
           <w:bottom w:val="single" w:sz="4" w:space="1" w:color="2E75B6"/>
         </w:pBdr>
       </w:pPr>
-      <w:bookmarkStart w:id="53" w:name="_Toc227918567"/>
+      <w:bookmarkStart w:id="53" w:name="_Toc227923059"/>
       <w:r>
         <w:t>8.2 Points d'Amélioration Identifiés</w:t>
       </w:r>
@@ -14604,7 +14191,7 @@
       <w:pPr>
         <w:pStyle w:val="Titre3"/>
       </w:pPr>
-      <w:bookmarkStart w:id="54" w:name="_Toc227918568"/>
+      <w:bookmarkStart w:id="54" w:name="_Toc227923060"/>
       <w:r>
         <w:t>8.2.1 Alimentation</w:t>
       </w:r>
@@ -14656,7 +14243,7 @@
       <w:pPr>
         <w:pStyle w:val="Titre3"/>
       </w:pPr>
-      <w:bookmarkStart w:id="55" w:name="_Toc227918569"/>
+      <w:bookmarkStart w:id="55" w:name="_Toc227923061"/>
       <w:r>
         <w:t>8.2.2 Régulation PID</w:t>
       </w:r>
@@ -14683,7 +14270,7 @@
       <w:pPr>
         <w:pStyle w:val="Titre3"/>
       </w:pPr>
-      <w:bookmarkStart w:id="56" w:name="_Toc227918570"/>
+      <w:bookmarkStart w:id="56" w:name="_Toc227923062"/>
       <w:r>
         <w:t>8.2.3 Interface et Fonctionnalités</w:t>
       </w:r>
@@ -14795,7 +14382,7 @@
           <w:bottom w:val="single" w:sz="4" w:space="1" w:color="2E75B6"/>
         </w:pBdr>
       </w:pPr>
-      <w:bookmarkStart w:id="57" w:name="_Toc227918571"/>
+      <w:bookmarkStart w:id="57" w:name="_Toc227923063"/>
       <w:r>
         <w:t>8.3 Conclusion Générale</w:t>
       </w:r>
@@ -14869,7 +14456,7 @@
         </w:pBdr>
         <w:shd w:val="clear" w:color="auto" w:fill="1F4E79"/>
       </w:pPr>
-      <w:bookmarkStart w:id="58" w:name="_Toc227918572"/>
+      <w:bookmarkStart w:id="58" w:name="_Toc227923064"/>
       <w:r>
         <w:lastRenderedPageBreak/>
         <w:t>9. Annexes</w:t>
@@ -14888,7 +14475,7 @@
           <w:bottom w:val="single" w:sz="4" w:space="1" w:color="2E75B6"/>
         </w:pBdr>
       </w:pPr>
-      <w:bookmarkStart w:id="59" w:name="_Toc227918573"/>
+      <w:bookmarkStart w:id="59" w:name="_Toc227923065"/>
       <w:r>
         <w:t>Annexe A – Chronologie du Projet</w:t>
       </w:r>
@@ -14923,12 +14510,6 @@
         <w:gridCol w:w="2607"/>
       </w:tblGrid>
       <w:tr>
-        <w:tblPrEx>
-          <w:tblCellMar>
-            <w:top w:w="0" w:type="dxa"/>
-            <w:bottom w:w="0" w:type="dxa"/>
-          </w:tblCellMar>
-        </w:tblPrEx>
         <w:trPr>
           <w:tblHeader/>
         </w:trPr>
@@ -15066,12 +14647,6 @@
         </w:tc>
       </w:tr>
       <w:tr>
-        <w:tblPrEx>
-          <w:tblCellMar>
-            <w:top w:w="0" w:type="dxa"/>
-            <w:bottom w:w="0" w:type="dxa"/>
-          </w:tblCellMar>
-        </w:tblPrEx>
         <w:tc>
           <w:tcPr>
             <w:tcW w:w="900" w:type="dxa"/>
@@ -15186,12 +14761,6 @@
         </w:tc>
       </w:tr>
       <w:tr>
-        <w:tblPrEx>
-          <w:tblCellMar>
-            <w:top w:w="0" w:type="dxa"/>
-            <w:bottom w:w="0" w:type="dxa"/>
-          </w:tblCellMar>
-        </w:tblPrEx>
         <w:tc>
           <w:tcPr>
             <w:tcW w:w="900" w:type="dxa"/>
@@ -15306,12 +14875,6 @@
         </w:tc>
       </w:tr>
       <w:tr>
-        <w:tblPrEx>
-          <w:tblCellMar>
-            <w:top w:w="0" w:type="dxa"/>
-            <w:bottom w:w="0" w:type="dxa"/>
-          </w:tblCellMar>
-        </w:tblPrEx>
         <w:tc>
           <w:tcPr>
             <w:tcW w:w="900" w:type="dxa"/>
@@ -15426,12 +14989,6 @@
         </w:tc>
       </w:tr>
       <w:tr>
-        <w:tblPrEx>
-          <w:tblCellMar>
-            <w:top w:w="0" w:type="dxa"/>
-            <w:bottom w:w="0" w:type="dxa"/>
-          </w:tblCellMar>
-        </w:tblPrEx>
         <w:tc>
           <w:tcPr>
             <w:tcW w:w="900" w:type="dxa"/>
@@ -15546,12 +15103,6 @@
         </w:tc>
       </w:tr>
       <w:tr>
-        <w:tblPrEx>
-          <w:tblCellMar>
-            <w:top w:w="0" w:type="dxa"/>
-            <w:bottom w:w="0" w:type="dxa"/>
-          </w:tblCellMar>
-        </w:tblPrEx>
         <w:tc>
           <w:tcPr>
             <w:tcW w:w="900" w:type="dxa"/>
@@ -15676,12 +15227,6 @@
         </w:tc>
       </w:tr>
       <w:tr>
-        <w:tblPrEx>
-          <w:tblCellMar>
-            <w:top w:w="0" w:type="dxa"/>
-            <w:bottom w:w="0" w:type="dxa"/>
-          </w:tblCellMar>
-        </w:tblPrEx>
         <w:tc>
           <w:tcPr>
             <w:tcW w:w="900" w:type="dxa"/>
@@ -15796,12 +15341,6 @@
         </w:tc>
       </w:tr>
       <w:tr>
-        <w:tblPrEx>
-          <w:tblCellMar>
-            <w:top w:w="0" w:type="dxa"/>
-            <w:bottom w:w="0" w:type="dxa"/>
-          </w:tblCellMar>
-        </w:tblPrEx>
         <w:tc>
           <w:tcPr>
             <w:tcW w:w="900" w:type="dxa"/>
@@ -15916,12 +15455,6 @@
         </w:tc>
       </w:tr>
       <w:tr>
-        <w:tblPrEx>
-          <w:tblCellMar>
-            <w:top w:w="0" w:type="dxa"/>
-            <w:bottom w:w="0" w:type="dxa"/>
-          </w:tblCellMar>
-        </w:tblPrEx>
         <w:tc>
           <w:tcPr>
             <w:tcW w:w="900" w:type="dxa"/>
@@ -16036,12 +15569,6 @@
         </w:tc>
       </w:tr>
       <w:tr>
-        <w:tblPrEx>
-          <w:tblCellMar>
-            <w:top w:w="0" w:type="dxa"/>
-            <w:bottom w:w="0" w:type="dxa"/>
-          </w:tblCellMar>
-        </w:tblPrEx>
         <w:tc>
           <w:tcPr>
             <w:tcW w:w="900" w:type="dxa"/>
@@ -16156,12 +15683,6 @@
         </w:tc>
       </w:tr>
       <w:tr>
-        <w:tblPrEx>
-          <w:tblCellMar>
-            <w:top w:w="0" w:type="dxa"/>
-            <w:bottom w:w="0" w:type="dxa"/>
-          </w:tblCellMar>
-        </w:tblPrEx>
         <w:tc>
           <w:tcPr>
             <w:tcW w:w="900" w:type="dxa"/>
@@ -16276,12 +15797,6 @@
         </w:tc>
       </w:tr>
       <w:tr>
-        <w:tblPrEx>
-          <w:tblCellMar>
-            <w:top w:w="0" w:type="dxa"/>
-            <w:bottom w:w="0" w:type="dxa"/>
-          </w:tblCellMar>
-        </w:tblPrEx>
         <w:tc>
           <w:tcPr>
             <w:tcW w:w="900" w:type="dxa"/>
@@ -16396,12 +15911,6 @@
         </w:tc>
       </w:tr>
       <w:tr>
-        <w:tblPrEx>
-          <w:tblCellMar>
-            <w:top w:w="0" w:type="dxa"/>
-            <w:bottom w:w="0" w:type="dxa"/>
-          </w:tblCellMar>
-        </w:tblPrEx>
         <w:tc>
           <w:tcPr>
             <w:tcW w:w="900" w:type="dxa"/>
@@ -16516,12 +16025,6 @@
         </w:tc>
       </w:tr>
       <w:tr>
-        <w:tblPrEx>
-          <w:tblCellMar>
-            <w:top w:w="0" w:type="dxa"/>
-            <w:bottom w:w="0" w:type="dxa"/>
-          </w:tblCellMar>
-        </w:tblPrEx>
         <w:tc>
           <w:tcPr>
             <w:tcW w:w="900" w:type="dxa"/>
@@ -16636,12 +16139,6 @@
         </w:tc>
       </w:tr>
       <w:tr>
-        <w:tblPrEx>
-          <w:tblCellMar>
-            <w:top w:w="0" w:type="dxa"/>
-            <w:bottom w:w="0" w:type="dxa"/>
-          </w:tblCellMar>
-        </w:tblPrEx>
         <w:tc>
           <w:tcPr>
             <w:tcW w:w="900" w:type="dxa"/>
@@ -16756,12 +16253,6 @@
         </w:tc>
       </w:tr>
       <w:tr>
-        <w:tblPrEx>
-          <w:tblCellMar>
-            <w:top w:w="0" w:type="dxa"/>
-            <w:bottom w:w="0" w:type="dxa"/>
-          </w:tblCellMar>
-        </w:tblPrEx>
         <w:tc>
           <w:tcPr>
             <w:tcW w:w="900" w:type="dxa"/>
@@ -16876,12 +16367,6 @@
         </w:tc>
       </w:tr>
       <w:tr>
-        <w:tblPrEx>
-          <w:tblCellMar>
-            <w:top w:w="0" w:type="dxa"/>
-            <w:bottom w:w="0" w:type="dxa"/>
-          </w:tblCellMar>
-        </w:tblPrEx>
         <w:tc>
           <w:tcPr>
             <w:tcW w:w="900" w:type="dxa"/>
@@ -17048,7 +16533,7 @@
           <w:bottom w:val="single" w:sz="4" w:space="1" w:color="2E75B6"/>
         </w:pBdr>
       </w:pPr>
-      <w:bookmarkStart w:id="60" w:name="_Toc227918574"/>
+      <w:bookmarkStart w:id="60" w:name="_Toc227923066"/>
       <w:r>
         <w:lastRenderedPageBreak/>
         <w:t>Annexe B – Bibliothèques Utilisées</w:t>
@@ -17083,12 +16568,6 @@
         <w:gridCol w:w="5026"/>
       </w:tblGrid>
       <w:tr>
-        <w:tblPrEx>
-          <w:tblCellMar>
-            <w:top w:w="0" w:type="dxa"/>
-            <w:bottom w:w="0" w:type="dxa"/>
-          </w:tblCellMar>
-        </w:tblPrEx>
         <w:trPr>
           <w:tblHeader/>
         </w:trPr>
@@ -17193,12 +16672,6 @@
         </w:tc>
       </w:tr>
       <w:tr>
-        <w:tblPrEx>
-          <w:tblCellMar>
-            <w:top w:w="0" w:type="dxa"/>
-            <w:bottom w:w="0" w:type="dxa"/>
-          </w:tblCellMar>
-        </w:tblPrEx>
         <w:tc>
           <w:tcPr>
             <w:tcW w:w="2800" w:type="dxa"/>
@@ -17305,12 +16778,6 @@
         </w:tc>
       </w:tr>
       <w:tr>
-        <w:tblPrEx>
-          <w:tblCellMar>
-            <w:top w:w="0" w:type="dxa"/>
-            <w:bottom w:w="0" w:type="dxa"/>
-          </w:tblCellMar>
-        </w:tblPrEx>
         <w:tc>
           <w:tcPr>
             <w:tcW w:w="2800" w:type="dxa"/>
@@ -17399,12 +16866,6 @@
         </w:tc>
       </w:tr>
       <w:tr>
-        <w:tblPrEx>
-          <w:tblCellMar>
-            <w:top w:w="0" w:type="dxa"/>
-            <w:bottom w:w="0" w:type="dxa"/>
-          </w:tblCellMar>
-        </w:tblPrEx>
         <w:tc>
           <w:tcPr>
             <w:tcW w:w="2800" w:type="dxa"/>
@@ -17501,12 +16962,6 @@
         </w:tc>
       </w:tr>
       <w:tr>
-        <w:tblPrEx>
-          <w:tblCellMar>
-            <w:top w:w="0" w:type="dxa"/>
-            <w:bottom w:w="0" w:type="dxa"/>
-          </w:tblCellMar>
-        </w:tblPrEx>
         <w:tc>
           <w:tcPr>
             <w:tcW w:w="2800" w:type="dxa"/>
@@ -17603,12 +17058,6 @@
         </w:tc>
       </w:tr>
       <w:tr>
-        <w:tblPrEx>
-          <w:tblCellMar>
-            <w:top w:w="0" w:type="dxa"/>
-            <w:bottom w:w="0" w:type="dxa"/>
-          </w:tblCellMar>
-        </w:tblPrEx>
         <w:tc>
           <w:tcPr>
             <w:tcW w:w="2800" w:type="dxa"/>
@@ -17695,12 +17144,6 @@
         </w:tc>
       </w:tr>
       <w:tr>
-        <w:tblPrEx>
-          <w:tblCellMar>
-            <w:top w:w="0" w:type="dxa"/>
-            <w:bottom w:w="0" w:type="dxa"/>
-          </w:tblCellMar>
-        </w:tblPrEx>
         <w:tc>
           <w:tcPr>
             <w:tcW w:w="2800" w:type="dxa"/>
@@ -17787,12 +17230,6 @@
         </w:tc>
       </w:tr>
       <w:tr>
-        <w:tblPrEx>
-          <w:tblCellMar>
-            <w:top w:w="0" w:type="dxa"/>
-            <w:bottom w:w="0" w:type="dxa"/>
-          </w:tblCellMar>
-        </w:tblPrEx>
         <w:tc>
           <w:tcPr>
             <w:tcW w:w="2800" w:type="dxa"/>
@@ -17881,12 +17318,6 @@
         </w:tc>
       </w:tr>
       <w:tr>
-        <w:tblPrEx>
-          <w:tblCellMar>
-            <w:top w:w="0" w:type="dxa"/>
-            <w:bottom w:w="0" w:type="dxa"/>
-          </w:tblCellMar>
-        </w:tblPrEx>
         <w:tc>
           <w:tcPr>
             <w:tcW w:w="2800" w:type="dxa"/>
@@ -18001,12 +17432,6 @@
         </w:tc>
       </w:tr>
       <w:tr>
-        <w:tblPrEx>
-          <w:tblCellMar>
-            <w:top w:w="0" w:type="dxa"/>
-            <w:bottom w:w="0" w:type="dxa"/>
-          </w:tblCellMar>
-        </w:tblPrEx>
         <w:tc>
           <w:tcPr>
             <w:tcW w:w="2800" w:type="dxa"/>
@@ -18095,12 +17520,6 @@
         </w:tc>
       </w:tr>
       <w:tr>
-        <w:tblPrEx>
-          <w:tblCellMar>
-            <w:top w:w="0" w:type="dxa"/>
-            <w:bottom w:w="0" w:type="dxa"/>
-          </w:tblCellMar>
-        </w:tblPrEx>
         <w:tc>
           <w:tcPr>
             <w:tcW w:w="2800" w:type="dxa"/>
@@ -18209,7 +17628,7 @@
           <w:bottom w:val="single" w:sz="4" w:space="1" w:color="2E75B6"/>
         </w:pBdr>
       </w:pPr>
-      <w:bookmarkStart w:id="61" w:name="_Toc227918575"/>
+      <w:bookmarkStart w:id="61" w:name="_Toc227923067"/>
       <w:r>
         <w:t>Annexe C – Glossaire</w:t>
       </w:r>
@@ -18242,12 +17661,6 @@
         <w:gridCol w:w="6526"/>
       </w:tblGrid>
       <w:tr>
-        <w:tblPrEx>
-          <w:tblCellMar>
-            <w:top w:w="0" w:type="dxa"/>
-            <w:bottom w:w="0" w:type="dxa"/>
-          </w:tblCellMar>
-        </w:tblPrEx>
         <w:trPr>
           <w:tblHeader/>
         </w:trPr>
@@ -18319,12 +17732,6 @@
         </w:tc>
       </w:tr>
       <w:tr>
-        <w:tblPrEx>
-          <w:tblCellMar>
-            <w:top w:w="0" w:type="dxa"/>
-            <w:bottom w:w="0" w:type="dxa"/>
-          </w:tblCellMar>
-        </w:tblPrEx>
         <w:tc>
           <w:tcPr>
             <w:tcW w:w="2500" w:type="dxa"/>
@@ -18429,12 +17836,6 @@
         </w:tc>
       </w:tr>
       <w:tr>
-        <w:tblPrEx>
-          <w:tblCellMar>
-            <w:top w:w="0" w:type="dxa"/>
-            <w:bottom w:w="0" w:type="dxa"/>
-          </w:tblCellMar>
-        </w:tblPrEx>
         <w:tc>
           <w:tcPr>
             <w:tcW w:w="2500" w:type="dxa"/>
@@ -18521,12 +17922,6 @@
         </w:tc>
       </w:tr>
       <w:tr>
-        <w:tblPrEx>
-          <w:tblCellMar>
-            <w:top w:w="0" w:type="dxa"/>
-            <w:bottom w:w="0" w:type="dxa"/>
-          </w:tblCellMar>
-        </w:tblPrEx>
         <w:tc>
           <w:tcPr>
             <w:tcW w:w="2500" w:type="dxa"/>
@@ -18585,12 +17980,6 @@
         </w:tc>
       </w:tr>
       <w:tr>
-        <w:tblPrEx>
-          <w:tblCellMar>
-            <w:top w:w="0" w:type="dxa"/>
-            <w:bottom w:w="0" w:type="dxa"/>
-          </w:tblCellMar>
-        </w:tblPrEx>
         <w:tc>
           <w:tcPr>
             <w:tcW w:w="2500" w:type="dxa"/>
@@ -18649,12 +18038,6 @@
         </w:tc>
       </w:tr>
       <w:tr>
-        <w:tblPrEx>
-          <w:tblCellMar>
-            <w:top w:w="0" w:type="dxa"/>
-            <w:bottom w:w="0" w:type="dxa"/>
-          </w:tblCellMar>
-        </w:tblPrEx>
         <w:tc>
           <w:tcPr>
             <w:tcW w:w="2500" w:type="dxa"/>
@@ -18715,12 +18098,6 @@
         </w:tc>
       </w:tr>
       <w:tr>
-        <w:tblPrEx>
-          <w:tblCellMar>
-            <w:top w:w="0" w:type="dxa"/>
-            <w:bottom w:w="0" w:type="dxa"/>
-          </w:tblCellMar>
-        </w:tblPrEx>
         <w:tc>
           <w:tcPr>
             <w:tcW w:w="2500" w:type="dxa"/>
@@ -18781,12 +18158,6 @@
         </w:tc>
       </w:tr>
       <w:tr>
-        <w:tblPrEx>
-          <w:tblCellMar>
-            <w:top w:w="0" w:type="dxa"/>
-            <w:bottom w:w="0" w:type="dxa"/>
-          </w:tblCellMar>
-        </w:tblPrEx>
         <w:tc>
           <w:tcPr>
             <w:tcW w:w="2500" w:type="dxa"/>
@@ -18855,12 +18226,6 @@
         </w:tc>
       </w:tr>
       <w:tr>
-        <w:tblPrEx>
-          <w:tblCellMar>
-            <w:top w:w="0" w:type="dxa"/>
-            <w:bottom w:w="0" w:type="dxa"/>
-          </w:tblCellMar>
-        </w:tblPrEx>
         <w:tc>
           <w:tcPr>
             <w:tcW w:w="2500" w:type="dxa"/>
@@ -18919,12 +18284,6 @@
         </w:tc>
       </w:tr>
       <w:tr>
-        <w:tblPrEx>
-          <w:tblCellMar>
-            <w:top w:w="0" w:type="dxa"/>
-            <w:bottom w:w="0" w:type="dxa"/>
-          </w:tblCellMar>
-        </w:tblPrEx>
         <w:tc>
           <w:tcPr>
             <w:tcW w:w="2500" w:type="dxa"/>
@@ -19011,12 +18370,6 @@
         </w:tc>
       </w:tr>
       <w:tr>
-        <w:tblPrEx>
-          <w:tblCellMar>
-            <w:top w:w="0" w:type="dxa"/>
-            <w:bottom w:w="0" w:type="dxa"/>
-          </w:tblCellMar>
-        </w:tblPrEx>
         <w:tc>
           <w:tcPr>
             <w:tcW w:w="2500" w:type="dxa"/>
@@ -19075,12 +18428,6 @@
         </w:tc>
       </w:tr>
       <w:tr>
-        <w:tblPrEx>
-          <w:tblCellMar>
-            <w:top w:w="0" w:type="dxa"/>
-            <w:bottom w:w="0" w:type="dxa"/>
-          </w:tblCellMar>
-        </w:tblPrEx>
         <w:tc>
           <w:tcPr>
             <w:tcW w:w="2500" w:type="dxa"/>
@@ -19157,12 +18504,6 @@
         </w:tc>
       </w:tr>
       <w:tr>
-        <w:tblPrEx>
-          <w:tblCellMar>
-            <w:top w:w="0" w:type="dxa"/>
-            <w:bottom w:w="0" w:type="dxa"/>
-          </w:tblCellMar>
-        </w:tblPrEx>
         <w:tc>
           <w:tcPr>
             <w:tcW w:w="2500" w:type="dxa"/>
@@ -19221,12 +18562,6 @@
         </w:tc>
       </w:tr>
       <w:tr>
-        <w:tblPrEx>
-          <w:tblCellMar>
-            <w:top w:w="0" w:type="dxa"/>
-            <w:bottom w:w="0" w:type="dxa"/>
-          </w:tblCellMar>
-        </w:tblPrEx>
         <w:tc>
           <w:tcPr>
             <w:tcW w:w="2500" w:type="dxa"/>
@@ -19303,12 +18638,6 @@
         </w:tc>
       </w:tr>
       <w:tr>
-        <w:tblPrEx>
-          <w:tblCellMar>
-            <w:top w:w="0" w:type="dxa"/>
-            <w:bottom w:w="0" w:type="dxa"/>
-          </w:tblCellMar>
-        </w:tblPrEx>
         <w:tc>
           <w:tcPr>
             <w:tcW w:w="2500" w:type="dxa"/>
@@ -19367,12 +18696,6 @@
         </w:tc>
       </w:tr>
       <w:tr>
-        <w:tblPrEx>
-          <w:tblCellMar>
-            <w:top w:w="0" w:type="dxa"/>
-            <w:bottom w:w="0" w:type="dxa"/>
-          </w:tblCellMar>
-        </w:tblPrEx>
         <w:tc>
           <w:tcPr>
             <w:tcW w:w="2500" w:type="dxa"/>
@@ -19437,8 +18760,8 @@
       </w:pPr>
     </w:p>
     <w:sectPr>
-      <w:headerReference w:type="default" r:id="rId16"/>
-      <w:footerReference w:type="default" r:id="rId17"/>
+      <w:headerReference w:type="default" r:id="rId18"/>
+      <w:footerReference w:type="default" r:id="rId19"/>
       <w:pgSz w:w="11906" w:h="16838"/>
       <w:pgMar w:top="1080" w:right="1080" w:bottom="1080" w:left="1080" w:header="708" w:footer="708" w:gutter="0"/>
       <w:cols w:space="720"/>
@@ -19482,7 +18805,23 @@
         <w:sz w:val="18"/>
         <w:szCs w:val="18"/>
       </w:rPr>
-      <w:t xml:space="preserve">ROTH – EUPHRASIE – BALD – BONDON   |   </w:t>
+      <w:t>ROTH – EUPHRASIE – BALD</w:t>
+    </w:r>
+    <w:r>
+      <w:rPr>
+        <w:color w:val="888888"/>
+        <w:sz w:val="18"/>
+        <w:szCs w:val="18"/>
+      </w:rPr>
+      <w:t>E</w:t>
+    </w:r>
+    <w:r>
+      <w:rPr>
+        <w:color w:val="888888"/>
+        <w:sz w:val="18"/>
+        <w:szCs w:val="18"/>
+      </w:rPr>
+      <w:t xml:space="preserve"> – BONDON   |   </w:t>
     </w:r>
     <w:r>
       <w:rPr>
@@ -20318,6 +19657,7 @@
   <w:style w:type="character" w:default="1" w:styleId="Policepardfaut">
     <w:name w:val="Default Paragraph Font"/>
     <w:uiPriority w:val="1"/>
+    <w:semiHidden/>
     <w:unhideWhenUsed/>
   </w:style>
   <w:style w:type="table" w:default="1" w:styleId="TableauNormal">
@@ -20491,6 +19831,48 @@
       <w:spacing w:after="100"/>
       <w:ind w:left="440"/>
     </w:pPr>
+  </w:style>
+  <w:style w:type="paragraph" w:styleId="En-tte">
+    <w:name w:val="header"/>
+    <w:basedOn w:val="Normal"/>
+    <w:link w:val="En-tteCar"/>
+    <w:uiPriority w:val="99"/>
+    <w:unhideWhenUsed/>
+    <w:rsid w:val="002C09D0"/>
+    <w:pPr>
+      <w:tabs>
+        <w:tab w:val="center" w:pos="4536"/>
+        <w:tab w:val="right" w:pos="9072"/>
+      </w:tabs>
+    </w:pPr>
+  </w:style>
+  <w:style w:type="character" w:customStyle="1" w:styleId="En-tteCar">
+    <w:name w:val="En-tête Car"/>
+    <w:basedOn w:val="Policepardfaut"/>
+    <w:link w:val="En-tte"/>
+    <w:uiPriority w:val="99"/>
+    <w:rsid w:val="002C09D0"/>
+  </w:style>
+  <w:style w:type="paragraph" w:styleId="Pieddepage">
+    <w:name w:val="footer"/>
+    <w:basedOn w:val="Normal"/>
+    <w:link w:val="PieddepageCar"/>
+    <w:uiPriority w:val="99"/>
+    <w:unhideWhenUsed/>
+    <w:rsid w:val="002C09D0"/>
+    <w:pPr>
+      <w:tabs>
+        <w:tab w:val="center" w:pos="4536"/>
+        <w:tab w:val="right" w:pos="9072"/>
+      </w:tabs>
+    </w:pPr>
+  </w:style>
+  <w:style w:type="character" w:customStyle="1" w:styleId="PieddepageCar">
+    <w:name w:val="Pied de page Car"/>
+    <w:basedOn w:val="Policepardfaut"/>
+    <w:link w:val="Pieddepage"/>
+    <w:uiPriority w:val="99"/>
+    <w:rsid w:val="002C09D0"/>
   </w:style>
 </w:styles>
 </file>

</xml_diff>